<commit_message>
Update MLLibrary BLJE: Integrate 2025 Code of Judicial Conduct and Accountability (A.M. No. 25-04-04-SC) and update Canons & Definitions
</commit_message>
<xml_diff>
--- a/First Sem 1st Year/Subjects/Basic Legal and Judiciary Ethics/Canons & definition.docx
+++ b/First Sem 1st Year/Subjects/Basic Legal and Judiciary Ethics/Canons & definition.docx
@@ -4,1370 +4,1498 @@
   <w:body>
     <w:p>
       <w:pPr>
-        <w:spacing w:before="0" w:after="80"/>
+        <w:spacing w:before="0" w:after="40"/>
         <w:jc w:val="center"/>
       </w:pPr>
       <w:r>
         <w:rPr>
           <w:rFonts w:ascii="Georgia" w:hAnsi="Georgia"/>
           <w:b/>
-          <w:color w:val="0F172A"/>
-          <w:sz w:val="40"/>
+          <w:color w:val="0F2C59"/>
+          <w:sz w:val="30"/>
         </w:rPr>
         <w:t>BASIC LEGAL AND JUDICIAL ETHICS (BLJE)</w:t>
+        <w:br/>
+      </w:r>
+      <w:r>
+        <w:rPr>
+          <w:rFonts w:ascii="Georgia" w:hAnsi="Georgia"/>
+          <w:color w:val="B45309"/>
+          <w:sz w:val="24"/>
+        </w:rPr>
+        <w:t>Comprehensive Guide to Canons, Statutory Mandates, and Plain-Language Definitions</w:t>
+        <w:br/>
+      </w:r>
+      <w:r>
+        <w:rPr>
+          <w:rFonts w:ascii="Calibri" w:hAnsi="Calibri"/>
+          <w:i/>
+          <w:color w:val="646E7D"/>
+          <w:sz w:val="20"/>
+        </w:rPr>
+        <w:t>Featuring the 2025 Code of Judicial Conduct and Accountability (A.M. No. 25-04-04-SC), CPRA, CCCP, and Historical CPR &amp; NCJC Evolution</w:t>
       </w:r>
     </w:p>
     <w:p>
       <w:pPr>
-        <w:spacing w:before="0" w:after="320"/>
+        <w:spacing w:before="80" w:after="200"/>
         <w:jc w:val="center"/>
       </w:pPr>
       <w:r>
         <w:rPr>
-          <w:rFonts w:ascii="Arial" w:hAnsi="Arial"/>
-          <w:i/>
-          <w:color w:val="B45309"/>
-          <w:sz w:val="22"/>
+          <w:color w:val="B4BECD"/>
         </w:rPr>
-        <w:t>Comprehensive Guide to Canons, Statutory Mandates, and Plain-Language Definitions</w:t>
+        <w:t>——————————————————————————————————————————————————</w:t>
       </w:r>
     </w:p>
     <w:p>
       <w:pPr>
         <w:keepNext/>
-        <w:spacing w:before="360" w:after="120"/>
+        <w:spacing w:before="320" w:after="80"/>
       </w:pPr>
       <w:r>
         <w:rPr>
           <w:rFonts w:ascii="Georgia" w:hAnsi="Georgia"/>
           <w:b/>
-          <w:color w:val="0F172A"/>
-          <w:sz w:val="28"/>
+          <w:color w:val="0F2C59"/>
+          <w:sz w:val="26"/>
         </w:rPr>
         <w:t>PART I: LEGAL ETHICS — CODE OF PROFESSIONAL RESPONSIBILITY AND ACCOUNTABILITY (CPRA)</w:t>
       </w:r>
     </w:p>
     <w:p>
       <w:pPr>
-        <w:spacing w:before="40" w:after="160" w:line="288" w:lineRule="auto"/>
+        <w:spacing w:before="0" w:after="120"/>
       </w:pPr>
       <w:r>
         <w:rPr>
-          <w:rFonts w:ascii="Calibri" w:hAnsi="Calibri"/>
           <w:i/>
-          <w:color w:val="475569"/>
-          <w:sz w:val="22"/>
+          <w:sz w:val="20"/>
         </w:rPr>
-        <w:t>Promulgated under A.M. No. 22-04-05-SC (Effective May 29, 2023), governing the conduct, ethical responsibilities, and professional accountability of all lawyers admitted to the Philippine Bar.</w:t>
+        <w:t>Promulgated under A.M. No. 22-04-05-SC / A.M. No. 22-09-01-SC (Effective May 29, 2023), governing the conduct, ethical responsibilities, and disciplinary accountability of all members of the Philippine Bar.</w:t>
       </w:r>
     </w:p>
     <w:p>
       <w:pPr>
         <w:keepNext/>
-        <w:spacing w:before="240" w:after="80"/>
+        <w:spacing w:before="160" w:after="40"/>
       </w:pPr>
       <w:r>
         <w:rPr>
-          <w:rFonts w:ascii="Georgia" w:hAnsi="Georgia"/>
+          <w:rFonts w:ascii="Calibri" w:hAnsi="Calibri"/>
           <w:b/>
-          <w:color w:val="B45309"/>
-          <w:sz w:val="24"/>
+          <w:color w:val="0F2C59"/>
+          <w:sz w:val="23"/>
         </w:rPr>
         <w:t>Canon I: Independence</w:t>
       </w:r>
     </w:p>
     <w:p>
       <w:pPr>
-        <w:spacing w:before="40" w:after="120" w:line="288" w:lineRule="auto"/>
+        <w:spacing w:before="0" w:after="40" w:line="276" w:lineRule="auto"/>
+      </w:pPr>
+      <w:r>
+        <w:rPr>
+          <w:b/>
+          <w:color w:val="192D50"/>
+        </w:rPr>
+        <w:t xml:space="preserve">Core Legal Mandate: </w:t>
+      </w:r>
+      <w:r>
+        <w:t>A lawyer shall maintain professional independence at all times, free from improper outside influence, political pressure, client control over legal discretion, or commercial interests.</w:t>
+      </w:r>
+    </w:p>
+    <w:p>
+      <w:pPr>
+        <w:spacing w:before="0" w:after="120" w:line="276" w:lineRule="auto"/>
+      </w:pPr>
+      <w:r>
+        <w:rPr>
+          <w:b/>
+          <w:color w:val="B45309"/>
+        </w:rPr>
+        <w:t xml:space="preserve">Practical Meaning: </w:t>
+      </w:r>
+      <w:r>
+        <w:rPr>
+          <w:i/>
+        </w:rPr>
+        <w:t>"Stand your ground. Never let money, politics, personal friendships, or outside pressure dictate your legal advice or compromise your duty as an officer of the court."</w:t>
+      </w:r>
+    </w:p>
+    <w:p>
+      <w:pPr>
+        <w:keepNext/>
+        <w:spacing w:before="160" w:after="40"/>
       </w:pPr>
       <w:r>
         <w:rPr>
           <w:rFonts w:ascii="Calibri" w:hAnsi="Calibri"/>
           <w:b/>
-          <w:color w:val="0F172A"/>
-          <w:sz w:val="22"/>
-        </w:rPr>
-        <w:t xml:space="preserve">Core Legal Mandate: </w:t>
-      </w:r>
-      <w:r>
-        <w:rPr>
-          <w:rFonts w:ascii="Calibri" w:hAnsi="Calibri"/>
-          <w:color w:val="334155"/>
-          <w:sz w:val="22"/>
-        </w:rPr>
-        <w:t>A lawyer shall maintain professional independence at all times, free from improper influence, extraneous pressure, political interference, commercial control, or self-interest.</w:t>
-      </w:r>
-    </w:p>
-    <w:p>
-      <w:pPr>
-        <w:spacing w:before="0" w:after="160" w:line="288" w:lineRule="auto"/>
-        <w:ind w:left="360"/>
-      </w:pPr>
-      <w:r>
-        <w:rPr>
-          <w:rFonts w:ascii="Calibri" w:hAnsi="Calibri"/>
-          <w:b/>
-          <w:color w:val="B45309"/>
-          <w:sz w:val="21"/>
-        </w:rPr>
-        <w:t xml:space="preserve">Practical Meaning: </w:t>
-      </w:r>
-      <w:r>
-        <w:rPr>
-          <w:rFonts w:ascii="Calibri" w:hAnsi="Calibri"/>
-          <w:i/>
-          <w:color w:val="334155"/>
-          <w:sz w:val="21"/>
-        </w:rPr>
-        <w:t>"Stand your ground." Never let money, politics, personal friendships, or outside forces dictate your legal advice or trial strategy. A lawyer's ultimate loyalty is to the Constitution, the rule of law, and the administration of justice.</w:t>
-      </w:r>
-    </w:p>
-    <w:p>
-      <w:pPr>
-        <w:keepNext/>
-        <w:spacing w:before="240" w:after="80"/>
-      </w:pPr>
-      <w:r>
-        <w:rPr>
-          <w:rFonts w:ascii="Georgia" w:hAnsi="Georgia"/>
-          <w:b/>
-          <w:color w:val="B45309"/>
-          <w:sz w:val="24"/>
+          <w:color w:val="0F2C59"/>
+          <w:sz w:val="23"/>
         </w:rPr>
         <w:t>Canon II: Propriety</w:t>
       </w:r>
     </w:p>
     <w:p>
       <w:pPr>
-        <w:spacing w:before="40" w:after="120" w:line="288" w:lineRule="auto"/>
+        <w:spacing w:before="0" w:after="40" w:line="276" w:lineRule="auto"/>
+      </w:pPr>
+      <w:r>
+        <w:rPr>
+          <w:b/>
+          <w:color w:val="192D50"/>
+        </w:rPr>
+        <w:t xml:space="preserve">Core Legal Mandate: </w:t>
+      </w:r>
+      <w:r>
+        <w:t>A lawyer shall act with decency, dignity, honor, and professional respect in all personal, public, commercial, and online interactions. A lawyer shall not engage in unlawful, dishonest, deceitful, or scandalous conduct.</w:t>
+      </w:r>
+    </w:p>
+    <w:p>
+      <w:pPr>
+        <w:spacing w:before="0" w:after="120" w:line="276" w:lineRule="auto"/>
+      </w:pPr>
+      <w:r>
+        <w:rPr>
+          <w:b/>
+          <w:color w:val="B45309"/>
+        </w:rPr>
+        <w:t xml:space="preserve">Practical Meaning: </w:t>
+      </w:r>
+      <w:r>
+        <w:rPr>
+          <w:i/>
+        </w:rPr>
+        <w:t>"Act with honor and class everywhere. A lawyer represents the legal profession 24/7—in court, in public gatherings, in commercial transactions, and on social media platforms."</w:t>
+      </w:r>
+    </w:p>
+    <w:p>
+      <w:pPr>
+        <w:keepNext/>
+        <w:spacing w:before="160" w:after="40"/>
       </w:pPr>
       <w:r>
         <w:rPr>
           <w:rFonts w:ascii="Calibri" w:hAnsi="Calibri"/>
           <w:b/>
-          <w:color w:val="0F172A"/>
-          <w:sz w:val="22"/>
-        </w:rPr>
-        <w:t xml:space="preserve">Core Legal Mandate: </w:t>
-      </w:r>
-      <w:r>
-        <w:rPr>
-          <w:rFonts w:ascii="Calibri" w:hAnsi="Calibri"/>
-          <w:color w:val="334155"/>
-          <w:sz w:val="22"/>
-        </w:rPr>
-        <w:t>A lawyer shall act with decency, dignity, honor, and professional respect in all professional, public, and private dealings, including all forms of online and social media communication.</w:t>
-      </w:r>
-    </w:p>
-    <w:p>
-      <w:pPr>
-        <w:spacing w:before="0" w:after="160" w:line="288" w:lineRule="auto"/>
-        <w:ind w:left="360"/>
-      </w:pPr>
-      <w:r>
-        <w:rPr>
-          <w:rFonts w:ascii="Calibri" w:hAnsi="Calibri"/>
-          <w:b/>
-          <w:color w:val="B45309"/>
-          <w:sz w:val="21"/>
-        </w:rPr>
-        <w:t xml:space="preserve">Practical Meaning: </w:t>
-      </w:r>
-      <w:r>
-        <w:rPr>
-          <w:rFonts w:ascii="Calibri" w:hAnsi="Calibri"/>
-          <w:i/>
-          <w:color w:val="334155"/>
-          <w:sz w:val="21"/>
-        </w:rPr>
-        <w:t>"Act with honor and class everywhere." A lawyer represents the legal profession 24/7. Maintain honesty, decorum, and courtesy in court, in public interactions, and on social media platforms. The CPRA strictly prohibits vulgarity, harassment, spreading unverified legal gossip, and engaging in romantic or sexual relations with current clients.</w:t>
-      </w:r>
-    </w:p>
-    <w:p>
-      <w:pPr>
-        <w:keepNext/>
-        <w:spacing w:before="240" w:after="80"/>
-      </w:pPr>
-      <w:r>
-        <w:rPr>
-          <w:rFonts w:ascii="Georgia" w:hAnsi="Georgia"/>
-          <w:b/>
-          <w:color w:val="B45309"/>
-          <w:sz w:val="24"/>
+          <w:color w:val="0F2C59"/>
+          <w:sz w:val="23"/>
         </w:rPr>
         <w:t>Canon III: Fidelity</w:t>
       </w:r>
     </w:p>
     <w:p>
       <w:pPr>
-        <w:spacing w:before="40" w:after="120" w:line="288" w:lineRule="auto"/>
+        <w:spacing w:before="0" w:after="40" w:line="276" w:lineRule="auto"/>
+      </w:pPr>
+      <w:r>
+        <w:rPr>
+          <w:b/>
+          <w:color w:val="192D50"/>
+        </w:rPr>
+        <w:t xml:space="preserve">Core Legal Mandate: </w:t>
+      </w:r>
+      <w:r>
+        <w:t>A lawyer shall observe absolute loyalty, undivided fidelity, sacred confidentiality of privileged client communications, and strict accounting of all client property and trust funds.</w:t>
+      </w:r>
+    </w:p>
+    <w:p>
+      <w:pPr>
+        <w:spacing w:before="0" w:after="120" w:line="276" w:lineRule="auto"/>
+      </w:pPr>
+      <w:r>
+        <w:rPr>
+          <w:b/>
+          <w:color w:val="B45309"/>
+        </w:rPr>
+        <w:t xml:space="preserve">Practical Meaning: </w:t>
+      </w:r>
+      <w:r>
+        <w:rPr>
+          <w:i/>
+        </w:rPr>
+        <w:t>"Be completely loyal to your client. Guard client secrets permanently even after representation ends, avoid all conflicts of interest, and account for every centavo of client funds with utmost transparency."</w:t>
+      </w:r>
+    </w:p>
+    <w:p>
+      <w:pPr>
+        <w:keepNext/>
+        <w:spacing w:before="160" w:after="40"/>
       </w:pPr>
       <w:r>
         <w:rPr>
           <w:rFonts w:ascii="Calibri" w:hAnsi="Calibri"/>
           <w:b/>
-          <w:color w:val="0F172A"/>
-          <w:sz w:val="22"/>
-        </w:rPr>
-        <w:t xml:space="preserve">Core Legal Mandate: </w:t>
-      </w:r>
-      <w:r>
-        <w:rPr>
-          <w:rFonts w:ascii="Calibri" w:hAnsi="Calibri"/>
-          <w:color w:val="334155"/>
-          <w:sz w:val="22"/>
-        </w:rPr>
-        <w:t>A lawyer shall observe absolute loyalty, undivided fidelity, sacred confidentiality, diligent preservation of client property and funds, and strict avoidance of conflicting interests.</w:t>
-      </w:r>
-    </w:p>
-    <w:p>
-      <w:pPr>
-        <w:spacing w:before="0" w:after="160" w:line="288" w:lineRule="auto"/>
-        <w:ind w:left="360"/>
-      </w:pPr>
-      <w:r>
-        <w:rPr>
-          <w:rFonts w:ascii="Calibri" w:hAnsi="Calibri"/>
-          <w:b/>
-          <w:color w:val="B45309"/>
-          <w:sz w:val="21"/>
-        </w:rPr>
-        <w:t xml:space="preserve">Practical Meaning: </w:t>
-      </w:r>
-      <w:r>
-        <w:rPr>
-          <w:rFonts w:ascii="Calibri" w:hAnsi="Calibri"/>
-          <w:i/>
-          <w:color w:val="334155"/>
-          <w:sz w:val="21"/>
-        </w:rPr>
-        <w:t>"Be completely loyal to your client." Guard client secrets permanently even after the lawyer-client relationship terminates. Never represent opposing sides in the same or related disputes without informed written consent, and never commingle client trust money with personal operating funds.</w:t>
-      </w:r>
-    </w:p>
-    <w:p>
-      <w:pPr>
-        <w:keepNext/>
-        <w:spacing w:before="240" w:after="80"/>
-      </w:pPr>
-      <w:r>
-        <w:rPr>
-          <w:rFonts w:ascii="Georgia" w:hAnsi="Georgia"/>
-          <w:b/>
-          <w:color w:val="B45309"/>
-          <w:sz w:val="24"/>
+          <w:color w:val="0F2C59"/>
+          <w:sz w:val="23"/>
         </w:rPr>
         <w:t>Canon IV: Competence and Diligence</w:t>
       </w:r>
     </w:p>
     <w:p>
       <w:pPr>
-        <w:spacing w:before="40" w:after="120" w:line="288" w:lineRule="auto"/>
+        <w:spacing w:before="0" w:after="40" w:line="276" w:lineRule="auto"/>
+      </w:pPr>
+      <w:r>
+        <w:rPr>
+          <w:b/>
+          <w:color w:val="192D50"/>
+        </w:rPr>
+        <w:t xml:space="preserve">Core Legal Mandate: </w:t>
+      </w:r>
+      <w:r>
+        <w:t>A lawyer shall provide proficient, timely, thoroughly prepared, and skilled legal representation, continuously mastering legal developments and never neglecting legal matters entrusted by a client.</w:t>
+      </w:r>
+    </w:p>
+    <w:p>
+      <w:pPr>
+        <w:spacing w:before="0" w:after="120" w:line="276" w:lineRule="auto"/>
+      </w:pPr>
+      <w:r>
+        <w:rPr>
+          <w:b/>
+          <w:color w:val="B45309"/>
+        </w:rPr>
+        <w:t xml:space="preserve">Practical Meaning: </w:t>
+      </w:r>
+      <w:r>
+        <w:rPr>
+          <w:i/>
+        </w:rPr>
+        <w:t>"Do your job well, proficiently, and on time. Master the law and jurisprudence, avoid unmeritorious delays, prepare thoroughly for every hearing, and never abandon a client's cause."</w:t>
+      </w:r>
+    </w:p>
+    <w:p>
+      <w:pPr>
+        <w:keepNext/>
+        <w:spacing w:before="160" w:after="40"/>
       </w:pPr>
       <w:r>
         <w:rPr>
           <w:rFonts w:ascii="Calibri" w:hAnsi="Calibri"/>
           <w:b/>
-          <w:color w:val="0F172A"/>
-          <w:sz w:val="22"/>
-        </w:rPr>
-        <w:t xml:space="preserve">Core Legal Mandate: </w:t>
-      </w:r>
-      <w:r>
-        <w:rPr>
-          <w:rFonts w:ascii="Calibri" w:hAnsi="Calibri"/>
-          <w:color w:val="334155"/>
-          <w:sz w:val="22"/>
-        </w:rPr>
-        <w:t>A lawyer shall provide proficient, timely, thoroughly prepared, and skilled legal service, while actively maintaining continuous legal education and embracing modern legal technologies.</w:t>
-      </w:r>
-    </w:p>
-    <w:p>
-      <w:pPr>
-        <w:spacing w:before="0" w:after="160" w:line="288" w:lineRule="auto"/>
-        <w:ind w:left="360"/>
-      </w:pPr>
-      <w:r>
-        <w:rPr>
-          <w:rFonts w:ascii="Calibri" w:hAnsi="Calibri"/>
-          <w:b/>
-          <w:color w:val="B45309"/>
-          <w:sz w:val="21"/>
-        </w:rPr>
-        <w:t xml:space="preserve">Practical Meaning: </w:t>
-      </w:r>
-      <w:r>
-        <w:rPr>
-          <w:rFonts w:ascii="Calibri" w:hAnsi="Calibri"/>
-          <w:i/>
-          <w:color w:val="334155"/>
-          <w:sz w:val="21"/>
-        </w:rPr>
-        <w:t>"Do your job well, proficiently, and on time." Master the law and jurisprudence governing your cases, attend court hearings punctually and prepared, avoid unnecessary procedural delays, and keep clients regularly updated on significant case developments.</w:t>
-      </w:r>
-    </w:p>
-    <w:p>
-      <w:pPr>
-        <w:keepNext/>
-        <w:spacing w:before="240" w:after="80"/>
-      </w:pPr>
-      <w:r>
-        <w:rPr>
-          <w:rFonts w:ascii="Georgia" w:hAnsi="Georgia"/>
-          <w:b/>
-          <w:color w:val="B45309"/>
-          <w:sz w:val="24"/>
+          <w:color w:val="0F2C59"/>
+          <w:sz w:val="23"/>
         </w:rPr>
         <w:t>Canon V: Equality</w:t>
       </w:r>
     </w:p>
     <w:p>
       <w:pPr>
-        <w:spacing w:before="40" w:after="120" w:line="288" w:lineRule="auto"/>
+        <w:spacing w:before="0" w:after="40" w:line="276" w:lineRule="auto"/>
+      </w:pPr>
+      <w:r>
+        <w:rPr>
+          <w:b/>
+          <w:color w:val="192D50"/>
+        </w:rPr>
+        <w:t xml:space="preserve">Core Legal Mandate: </w:t>
+      </w:r>
+      <w:r>
+        <w:t>A lawyer shall adhere to non-discrimination principles and actively promote equal access to justice regardless of race, gender, religion, sexual orientation, disability, social status, or economic means.</w:t>
+      </w:r>
+    </w:p>
+    <w:p>
+      <w:pPr>
+        <w:spacing w:before="0" w:after="120" w:line="276" w:lineRule="auto"/>
+      </w:pPr>
+      <w:r>
+        <w:rPr>
+          <w:b/>
+          <w:color w:val="B45309"/>
+        </w:rPr>
+        <w:t xml:space="preserve">Practical Meaning: </w:t>
+      </w:r>
+      <w:r>
+        <w:rPr>
+          <w:i/>
+        </w:rPr>
+        <w:t>"Treat everyone fairly and with equal dignity. Do not discriminate against clients or court users, and actively serve poor, disadvantaged, and marginalized litigants through pro bono legal assistance."</w:t>
+      </w:r>
+    </w:p>
+    <w:p>
+      <w:pPr>
+        <w:keepNext/>
+        <w:spacing w:before="160" w:after="40"/>
       </w:pPr>
       <w:r>
         <w:rPr>
           <w:rFonts w:ascii="Calibri" w:hAnsi="Calibri"/>
           <w:b/>
-          <w:color w:val="0F172A"/>
-          <w:sz w:val="22"/>
-        </w:rPr>
-        <w:t xml:space="preserve">Core Legal Mandate: </w:t>
-      </w:r>
-      <w:r>
-        <w:rPr>
-          <w:rFonts w:ascii="Calibri" w:hAnsi="Calibri"/>
-          <w:color w:val="334155"/>
-          <w:sz w:val="22"/>
-        </w:rPr>
-        <w:t>A lawyer shall adhere to non-discrimination principles and actively promote equal access to justice for all persons, regardless of gender, race, religious belief, socioeconomic status, or disability.</w:t>
-      </w:r>
-    </w:p>
-    <w:p>
-      <w:pPr>
-        <w:spacing w:before="0" w:after="160" w:line="288" w:lineRule="auto"/>
-        <w:ind w:left="360"/>
-      </w:pPr>
-      <w:r>
-        <w:rPr>
-          <w:rFonts w:ascii="Calibri" w:hAnsi="Calibri"/>
-          <w:b/>
-          <w:color w:val="B45309"/>
-          <w:sz w:val="21"/>
-        </w:rPr>
-        <w:t xml:space="preserve">Practical Meaning: </w:t>
-      </w:r>
-      <w:r>
-        <w:rPr>
-          <w:rFonts w:ascii="Calibri" w:hAnsi="Calibri"/>
-          <w:i/>
-          <w:color w:val="334155"/>
-          <w:sz w:val="21"/>
-        </w:rPr>
-        <w:t>"Treat everyone fairly and with equal dignity." Do not discriminate against clients or litigants. Actively support and participate in legal aid programs, pro bono advocacy, and representation for the poor, marginalized, and underprivileged.</w:t>
-      </w:r>
-    </w:p>
-    <w:p>
-      <w:pPr>
-        <w:keepNext/>
-        <w:spacing w:before="240" w:after="80"/>
-      </w:pPr>
-      <w:r>
-        <w:rPr>
-          <w:rFonts w:ascii="Georgia" w:hAnsi="Georgia"/>
-          <w:b/>
-          <w:color w:val="B45309"/>
-          <w:sz w:val="24"/>
+          <w:color w:val="0F2C59"/>
+          <w:sz w:val="23"/>
         </w:rPr>
         <w:t>Canon VI: Accountability</w:t>
       </w:r>
     </w:p>
     <w:p>
       <w:pPr>
-        <w:spacing w:before="40" w:after="120" w:line="288" w:lineRule="auto"/>
+        <w:spacing w:before="0" w:after="40" w:line="276" w:lineRule="auto"/>
+      </w:pPr>
+      <w:r>
+        <w:rPr>
+          <w:b/>
+          <w:color w:val="192D50"/>
+        </w:rPr>
+        <w:t xml:space="preserve">Core Legal Mandate: </w:t>
+      </w:r>
+      <w:r>
+        <w:t>A lawyer is an officer of the court subject to moral responsibility and strict disciplinary procedures for any violation of the lawyer's oath, the CPRA, and orders of lawful authorities.</w:t>
+      </w:r>
+    </w:p>
+    <w:p>
+      <w:pPr>
+        <w:spacing w:before="0" w:after="120" w:line="276" w:lineRule="auto"/>
+      </w:pPr>
+      <w:r>
+        <w:rPr>
+          <w:b/>
+          <w:color w:val="B45309"/>
+        </w:rPr>
+        <w:t xml:space="preserve">Practical Meaning: </w:t>
+      </w:r>
+      <w:r>
+        <w:rPr>
+          <w:i/>
+        </w:rPr>
+        <w:t>"Own your actions. Lawyers who commit fraud, gross misconduct, ethical violations, or contemptuous acts will face disciplinary investigation, suspension, disbarment, or fines before the Supreme Court."</w:t>
+      </w:r>
+    </w:p>
+    <w:p>
+      <w:pPr>
+        <w:keepNext/>
+        <w:spacing w:before="320" w:after="80"/>
+      </w:pPr>
+      <w:r>
+        <w:rPr>
+          <w:rFonts w:ascii="Georgia" w:hAnsi="Georgia"/>
+          <w:b/>
+          <w:color w:val="0F2C59"/>
+          <w:sz w:val="26"/>
+        </w:rPr>
+        <w:t>PART II: JUDICIAL ETHICS — 2025 CODE OF JUDICIAL CONDUCT AND ACCOUNTABILITY (CJCA)</w:t>
+      </w:r>
+    </w:p>
+    <w:p>
+      <w:pPr>
+        <w:spacing w:before="0" w:after="120"/>
+      </w:pPr>
+      <w:r>
+        <w:rPr>
+          <w:i/>
+          <w:sz w:val="20"/>
+        </w:rPr>
+        <w:t>Promulgated under Supreme Court En Banc Resolution A.M. No. 25-04-04-SC (November 11, 2025; Effective December 21, 2025). This modern Code supersedes the 2004 New Code of Judicial Conduct (A.M. No. 03-05-01-SC) and establishes 7 comprehensive Canons integrating digital governance, AI ethics, and enhanced accountability.</w:t>
+      </w:r>
+    </w:p>
+    <w:p>
+      <w:pPr>
+        <w:keepNext/>
+        <w:spacing w:before="160" w:after="40"/>
       </w:pPr>
       <w:r>
         <w:rPr>
           <w:rFonts w:ascii="Calibri" w:hAnsi="Calibri"/>
           <w:b/>
-          <w:color w:val="0F172A"/>
-          <w:sz w:val="22"/>
+          <w:color w:val="0F2C59"/>
+          <w:sz w:val="23"/>
+        </w:rPr>
+        <w:t>Canon I: Independence (Sections 1–9)</w:t>
+      </w:r>
+    </w:p>
+    <w:p>
+      <w:pPr>
+        <w:spacing w:before="0" w:after="40" w:line="276" w:lineRule="auto"/>
+      </w:pPr>
+      <w:r>
+        <w:rPr>
+          <w:b/>
+          <w:color w:val="192D50"/>
         </w:rPr>
         <w:t xml:space="preserve">Core Legal Mandate: </w:t>
       </w:r>
       <w:r>
-        <w:rPr>
-          <w:rFonts w:ascii="Calibri" w:hAnsi="Calibri"/>
-          <w:color w:val="334155"/>
-          <w:sz w:val="22"/>
-        </w:rPr>
-        <w:t>A lawyer is an officer of the court subject to moral responsibility and strict disciplinary jurisdiction for any violation of ethical duties, oath, or professional standards.</w:t>
+        <w:t>Judicial independence is the performance of duties free from any undue or unwarranted influence. A judge shall uphold merit-based adjudication, reject external pressure, safeguard institutional independence from co-equal branches and local governments, and reject influence from former or incumbent colleagues.</w:t>
       </w:r>
     </w:p>
     <w:p>
       <w:pPr>
-        <w:spacing w:before="0" w:after="160" w:line="288" w:lineRule="auto"/>
-        <w:ind w:left="360"/>
+        <w:spacing w:before="0" w:after="120" w:line="276" w:lineRule="auto"/>
+      </w:pPr>
+      <w:r>
+        <w:rPr>
+          <w:b/>
+          <w:color w:val="B45309"/>
+        </w:rPr>
+        <w:t xml:space="preserve">Practical Meaning: </w:t>
+      </w:r>
+      <w:r>
+        <w:rPr>
+          <w:i/>
+        </w:rPr>
+        <w:t>"Decide solely on the law and evidence without fear or favor. Judges must remain impervious to political influence, executive pressure, public clamor, or personal relationships."</w:t>
+      </w:r>
+    </w:p>
+    <w:p>
+      <w:pPr>
+        <w:keepNext/>
+        <w:spacing w:before="160" w:after="40"/>
       </w:pPr>
       <w:r>
         <w:rPr>
           <w:rFonts w:ascii="Calibri" w:hAnsi="Calibri"/>
           <w:b/>
+          <w:color w:val="0F2C59"/>
+          <w:sz w:val="23"/>
+        </w:rPr>
+        <w:t>Canon II: Fidelity (Sections 1–7)</w:t>
+      </w:r>
+    </w:p>
+    <w:p>
+      <w:pPr>
+        <w:spacing w:before="0" w:after="40" w:line="276" w:lineRule="auto"/>
+      </w:pPr>
+      <w:r>
+        <w:rPr>
+          <w:b/>
+          <w:color w:val="192D50"/>
+        </w:rPr>
+        <w:t xml:space="preserve">Core Legal Mandate: </w:t>
+      </w:r>
+      <w:r>
+        <w:t>Fidelity is a judge's fealty to their role in the administration of justice and to the institution itself. A judge shall uphold the Constitution and the law, observe Supreme Court circulars, actively encourage amicable settlements, exercise efficient administrative supervision, and maintain judicial professionalism.</w:t>
+      </w:r>
+    </w:p>
+    <w:p>
+      <w:pPr>
+        <w:spacing w:before="0" w:after="120" w:line="276" w:lineRule="auto"/>
+      </w:pPr>
+      <w:r>
+        <w:rPr>
+          <w:b/>
           <w:color w:val="B45309"/>
-          <w:sz w:val="21"/>
         </w:rPr>
         <w:t xml:space="preserve">Practical Meaning: </w:t>
       </w:r>
       <w:r>
         <w:rPr>
-          <w:rFonts w:ascii="Calibri" w:hAnsi="Calibri"/>
           <w:i/>
-          <w:color w:val="334155"/>
-          <w:sz w:val="21"/>
         </w:rPr>
-        <w:t>"Own your actions." Lawyers who commit fraud, gross misconduct, ethical violations, or breach of trust are held directly accountable by the Supreme Court and Integrated Bar of the Philippines, facing sanctions ranging from reprimand, fine, and suspension, to permanent disbarment.</w:t>
+        <w:t>"Be faithful to your constitutional mission and institution. Serve the administration of justice loyally, manage court personnel effectively, and ensure that every proceeding reflects the highest institutional integrity."</w:t>
       </w:r>
     </w:p>
     <w:p>
       <w:pPr>
         <w:keepNext/>
-        <w:spacing w:before="360" w:after="120"/>
+        <w:spacing w:before="160" w:after="40"/>
+      </w:pPr>
+      <w:r>
+        <w:rPr>
+          <w:rFonts w:ascii="Calibri" w:hAnsi="Calibri"/>
+          <w:b/>
+          <w:color w:val="0F2C59"/>
+          <w:sz w:val="23"/>
+        </w:rPr>
+        <w:t>Canon III: Impartiality (Sections 1–13)</w:t>
+      </w:r>
+    </w:p>
+    <w:p>
+      <w:pPr>
+        <w:spacing w:before="0" w:after="40" w:line="276" w:lineRule="auto"/>
+      </w:pPr>
+      <w:r>
+        <w:rPr>
+          <w:b/>
+          <w:color w:val="192D50"/>
+        </w:rPr>
+        <w:t xml:space="preserve">Core Legal Mandate: </w:t>
+      </w:r>
+      <w:r>
+        <w:t>Impartiality is essential to the proper discharge of judicial office. A judge shall perform duties without bias, avoid ex parte communications, and observe strict rules on mandatory inhibition (8 enumerated grounds under Sec. 11) and voluntary inhibition (3 criteria under Sec. 12).</w:t>
+      </w:r>
+    </w:p>
+    <w:p>
+      <w:pPr>
+        <w:spacing w:before="0" w:after="120" w:line="276" w:lineRule="auto"/>
+      </w:pPr>
+      <w:r>
+        <w:rPr>
+          <w:b/>
+          <w:color w:val="B45309"/>
+        </w:rPr>
+        <w:t xml:space="preserve">Practical Meaning: </w:t>
+      </w:r>
+      <w:r>
+        <w:rPr>
+          <w:i/>
+        </w:rPr>
+        <w:t>"Act as an impeccably neutral referee. Never take sides, never communicate secretly with one party, and step aside through inhibition whenever personal bias, financial interest, or family ties could reasonably cloud judicial neutrality."</w:t>
+      </w:r>
+    </w:p>
+    <w:p>
+      <w:pPr>
+        <w:keepNext/>
+        <w:spacing w:before="160" w:after="40"/>
+      </w:pPr>
+      <w:r>
+        <w:rPr>
+          <w:rFonts w:ascii="Calibri" w:hAnsi="Calibri"/>
+          <w:b/>
+          <w:color w:val="0F2C59"/>
+          <w:sz w:val="23"/>
+        </w:rPr>
+        <w:t>Canon IV: Propriety (Sections 1–29)</w:t>
+      </w:r>
+    </w:p>
+    <w:p>
+      <w:pPr>
+        <w:spacing w:before="0" w:after="40" w:line="276" w:lineRule="auto"/>
+      </w:pPr>
+      <w:r>
+        <w:rPr>
+          <w:b/>
+          <w:color w:val="192D50"/>
+        </w:rPr>
+        <w:t xml:space="preserve">Core Legal Mandate: </w:t>
+      </w:r>
+      <w:r>
+        <w:t>Propriety encompasses a judge's conduct, behavior, and attitude across all platforms. A judge shall live modestly, maintain judicial temperament, observe proper courtroom decorum and black robe wearing, manage family/financial interests, and strictly comply with the Rules on the Use of Social Media (Sec. 22–29) avoiding sub judice violations and online misconduct.</w:t>
+      </w:r>
+    </w:p>
+    <w:p>
+      <w:pPr>
+        <w:spacing w:before="0" w:after="120" w:line="276" w:lineRule="auto"/>
+      </w:pPr>
+      <w:r>
+        <w:rPr>
+          <w:b/>
+          <w:color w:val="B45309"/>
+        </w:rPr>
+        <w:t xml:space="preserve">Practical Meaning: </w:t>
+      </w:r>
+      <w:r>
+        <w:rPr>
+          <w:i/>
+        </w:rPr>
+        <w:t>"Live and conduct yourself beyond reproach everywhere. Avoid ostentatious displays of wealth, maintain calm judicial temperament, and use social media with utmost caution without commenting on pending cases or compromising judicial dignity."</w:t>
+      </w:r>
+    </w:p>
+    <w:p>
+      <w:pPr>
+        <w:keepNext/>
+        <w:spacing w:before="160" w:after="40"/>
+      </w:pPr>
+      <w:r>
+        <w:rPr>
+          <w:rFonts w:ascii="Calibri" w:hAnsi="Calibri"/>
+          <w:b/>
+          <w:color w:val="0F2C59"/>
+          <w:sz w:val="23"/>
+        </w:rPr>
+        <w:t>Canon V: Equality (Sections 1–5)</w:t>
+      </w:r>
+    </w:p>
+    <w:p>
+      <w:pPr>
+        <w:spacing w:before="0" w:after="40" w:line="276" w:lineRule="auto"/>
+      </w:pPr>
+      <w:r>
+        <w:rPr>
+          <w:b/>
+          <w:color w:val="192D50"/>
+        </w:rPr>
+        <w:t xml:space="preserve">Core Legal Mandate: </w:t>
+      </w:r>
+      <w:r>
+        <w:t>Equality before the courts guarantees fair and equal treatment in all adjudicative and administrative matters without discrimination. A judge shall avoid stereotyping and provide permissible differential treatment and reasonable accommodations for vulnerable persons (Sec. 4–5).</w:t>
+      </w:r>
+    </w:p>
+    <w:p>
+      <w:pPr>
+        <w:spacing w:before="0" w:after="120" w:line="276" w:lineRule="auto"/>
+      </w:pPr>
+      <w:r>
+        <w:rPr>
+          <w:b/>
+          <w:color w:val="B45309"/>
+        </w:rPr>
+        <w:t xml:space="preserve">Practical Meaning: </w:t>
+      </w:r>
+      <w:r>
+        <w:rPr>
+          <w:i/>
+        </w:rPr>
+        <w:t>"Ensure equal justice and human dignity for all. Protect vulnerable sectors—including women, children, persons with disabilities, the elderly, indigent litigants, and minorities—with accessible courtroom accommodations."</w:t>
+      </w:r>
+    </w:p>
+    <w:p>
+      <w:pPr>
+        <w:keepNext/>
+        <w:spacing w:before="160" w:after="40"/>
+      </w:pPr>
+      <w:r>
+        <w:rPr>
+          <w:rFonts w:ascii="Calibri" w:hAnsi="Calibri"/>
+          <w:b/>
+          <w:color w:val="0F2C59"/>
+          <w:sz w:val="23"/>
+        </w:rPr>
+        <w:t>Canon VI: Competence and Diligence (Sections 1–9)</w:t>
+      </w:r>
+    </w:p>
+    <w:p>
+      <w:pPr>
+        <w:spacing w:before="0" w:after="40" w:line="276" w:lineRule="auto"/>
+      </w:pPr>
+      <w:r>
+        <w:rPr>
+          <w:b/>
+          <w:color w:val="192D50"/>
+        </w:rPr>
+        <w:t xml:space="preserve">Core Legal Mandate: </w:t>
+      </w:r>
+      <w:r>
+        <w:t>Competence and diligence require continuous mastery of law and jurisprudence, prompt disposition of cases, personal decision-writing, efficient court management, and the ethical use of technology and Artificial Intelligence (Sec. 5–6), where AI is permitted only as a research aid and never as a substitute for judicial discernment.</w:t>
+      </w:r>
+    </w:p>
+    <w:p>
+      <w:pPr>
+        <w:spacing w:before="0" w:after="120" w:line="276" w:lineRule="auto"/>
+      </w:pPr>
+      <w:r>
+        <w:rPr>
+          <w:b/>
+          <w:color w:val="B45309"/>
+        </w:rPr>
+        <w:t xml:space="preserve">Practical Meaning: </w:t>
+      </w:r>
+      <w:r>
+        <w:rPr>
+          <w:i/>
+        </w:rPr>
+        <w:t>"Master the law, decide promptly, and write your own rulings. Use modern digital tools and AI responsibly for legal research while maintaining human wisdom, personal decision-making, and total dedication to timely justice."</w:t>
+      </w:r>
+    </w:p>
+    <w:p>
+      <w:pPr>
+        <w:keepNext/>
+        <w:spacing w:before="160" w:after="40"/>
+      </w:pPr>
+      <w:r>
+        <w:rPr>
+          <w:rFonts w:ascii="Calibri" w:hAnsi="Calibri"/>
+          <w:b/>
+          <w:color w:val="0F2C59"/>
+          <w:sz w:val="23"/>
+        </w:rPr>
+        <w:t>Canon VII: Accountability (Sections 1–34)</w:t>
+      </w:r>
+    </w:p>
+    <w:p>
+      <w:pPr>
+        <w:spacing w:before="0" w:after="40" w:line="276" w:lineRule="auto"/>
+      </w:pPr>
+      <w:r>
+        <w:rPr>
+          <w:b/>
+          <w:color w:val="192D50"/>
+        </w:rPr>
+        <w:t xml:space="preserve">Core Legal Mandate: </w:t>
+      </w:r>
+      <w:r>
+        <w:t>Judges are strictly accountable for their conduct under the disciplinary authority of the Supreme Court and Judicial Integrity Office (JIO). Offenses are tiered into Serious, Less Serious, and Light with definitive penalties, Modifying Circumstances, immediately executory orders, and strict 5-year criteria for judicial clemency petitions.</w:t>
+      </w:r>
+    </w:p>
+    <w:p>
+      <w:pPr>
+        <w:spacing w:before="0" w:after="120" w:line="276" w:lineRule="auto"/>
+      </w:pPr>
+      <w:r>
+        <w:rPr>
+          <w:b/>
+          <w:color w:val="B45309"/>
+        </w:rPr>
+        <w:t xml:space="preserve">Practical Meaning: </w:t>
+      </w:r>
+      <w:r>
+        <w:rPr>
+          <w:i/>
+        </w:rPr>
+        <w:t>"Accountability is non-negotiable. Ethical breaches will be investigated swiftly by the JIO, resulting in suspension, heavy fines, or dismissal from service, reinforcing that judicial office is a sacred public trust."</w:t>
+      </w:r>
+    </w:p>
+    <w:p>
+      <w:pPr>
+        <w:keepNext/>
+        <w:spacing w:before="320" w:after="80"/>
       </w:pPr>
       <w:r>
         <w:rPr>
           <w:rFonts w:ascii="Georgia" w:hAnsi="Georgia"/>
           <w:b/>
-          <w:color w:val="0F172A"/>
-          <w:sz w:val="28"/>
-        </w:rPr>
-        <w:t>PART II: JUDICIAL ETHICS — NEW CODE OF JUDICIAL CONDUCT (NCJC)</w:t>
-      </w:r>
-    </w:p>
-    <w:p>
-      <w:pPr>
-        <w:spacing w:before="40" w:after="160" w:line="288" w:lineRule="auto"/>
-      </w:pPr>
-      <w:r>
-        <w:rPr>
-          <w:rFonts w:ascii="Calibri" w:hAnsi="Calibri"/>
-          <w:i/>
-          <w:color w:val="475569"/>
-          <w:sz w:val="22"/>
-        </w:rPr>
-        <w:t>Promulgated under A.M. No. 03-05-01-SC (incorporating the international Bangalore Principles of Judicial Conduct), establishing the universal moral and legal standards governing all Judges and Justices across the Philippine Judiciary.</w:t>
-      </w:r>
-    </w:p>
-    <w:p>
-      <w:pPr>
-        <w:keepNext/>
-        <w:spacing w:before="240" w:after="80"/>
-      </w:pPr>
-      <w:r>
-        <w:rPr>
-          <w:rFonts w:ascii="Georgia" w:hAnsi="Georgia"/>
-          <w:b/>
-          <w:color w:val="B45309"/>
-          <w:sz w:val="24"/>
-        </w:rPr>
-        <w:t>Canon 1: Independence</w:t>
-      </w:r>
-    </w:p>
-    <w:p>
-      <w:pPr>
-        <w:spacing w:before="40" w:after="120" w:line="288" w:lineRule="auto"/>
-      </w:pPr>
-      <w:r>
-        <w:rPr>
-          <w:rFonts w:ascii="Calibri" w:hAnsi="Calibri"/>
-          <w:b/>
-          <w:color w:val="0F172A"/>
-          <w:sz w:val="22"/>
-        </w:rPr>
-        <w:t xml:space="preserve">Core Legal Mandate: </w:t>
-      </w:r>
-      <w:r>
-        <w:rPr>
-          <w:rFonts w:ascii="Calibri" w:hAnsi="Calibri"/>
-          <w:color w:val="334155"/>
-          <w:sz w:val="22"/>
-        </w:rPr>
-        <w:t>Judicial independence is a pre-requisite to the rule of law. A judge shall exercise judicial power independently on the basis of facts and law, without regard to executive directives, legislative interests, partisan politics, or public pressure.</w:t>
-      </w:r>
-    </w:p>
-    <w:p>
-      <w:pPr>
-        <w:spacing w:before="0" w:after="160" w:line="288" w:lineRule="auto"/>
-        <w:ind w:left="360"/>
-      </w:pPr>
-      <w:r>
-        <w:rPr>
-          <w:rFonts w:ascii="Calibri" w:hAnsi="Calibri"/>
-          <w:b/>
-          <w:color w:val="B45309"/>
-          <w:sz w:val="21"/>
-        </w:rPr>
-        <w:t xml:space="preserve">Practical Meaning: </w:t>
-      </w:r>
-      <w:r>
-        <w:rPr>
-          <w:rFonts w:ascii="Calibri" w:hAnsi="Calibri"/>
-          <w:i/>
-          <w:color w:val="334155"/>
-          <w:sz w:val="21"/>
-        </w:rPr>
-        <w:t>"Decide without fear or favor." Judges must evaluate evidence and statutes objectively. They must never yield to executive officials, politicians, media sensationalism, public clamor, or personal acquaintances.</w:t>
-      </w:r>
-    </w:p>
-    <w:p>
-      <w:pPr>
-        <w:keepNext/>
-        <w:spacing w:before="240" w:after="80"/>
-      </w:pPr>
-      <w:r>
-        <w:rPr>
-          <w:rFonts w:ascii="Georgia" w:hAnsi="Georgia"/>
-          <w:b/>
-          <w:color w:val="B45309"/>
-          <w:sz w:val="24"/>
-        </w:rPr>
-        <w:t>Canon 2: Integrity</w:t>
-      </w:r>
-    </w:p>
-    <w:p>
-      <w:pPr>
-        <w:spacing w:before="40" w:after="120" w:line="288" w:lineRule="auto"/>
-      </w:pPr>
-      <w:r>
-        <w:rPr>
-          <w:rFonts w:ascii="Calibri" w:hAnsi="Calibri"/>
-          <w:b/>
-          <w:color w:val="0F172A"/>
-          <w:sz w:val="22"/>
-        </w:rPr>
-        <w:t xml:space="preserve">Core Legal Mandate: </w:t>
-      </w:r>
-      <w:r>
-        <w:rPr>
-          <w:rFonts w:ascii="Calibri" w:hAnsi="Calibri"/>
-          <w:color w:val="334155"/>
-          <w:sz w:val="22"/>
-        </w:rPr>
-        <w:t>Integrity is essential not only to the proper discharge of the judicial office, but also to personal conduct. A judge shall ensure that his or her conduct is above reproach in the view of a reasonable observer.</w:t>
-      </w:r>
-    </w:p>
-    <w:p>
-      <w:pPr>
-        <w:spacing w:before="0" w:after="160" w:line="288" w:lineRule="auto"/>
-        <w:ind w:left="360"/>
-      </w:pPr>
-      <w:r>
-        <w:rPr>
-          <w:rFonts w:ascii="Calibri" w:hAnsi="Calibri"/>
-          <w:b/>
-          <w:color w:val="B45309"/>
-          <w:sz w:val="21"/>
-        </w:rPr>
-        <w:t xml:space="preserve">Practical Meaning: </w:t>
-      </w:r>
-      <w:r>
-        <w:rPr>
-          <w:rFonts w:ascii="Calibri" w:hAnsi="Calibri"/>
-          <w:i/>
-          <w:color w:val="334155"/>
-          <w:sz w:val="21"/>
-        </w:rPr>
-        <w:t>"Be clean, honest, and untouchable." A judge's character and daily life must be spotless. Never solicit or accept gifts, bribes, or favors, and never engage in deceitful or fraudulent conduct in public or private life.</w:t>
-      </w:r>
-    </w:p>
-    <w:p>
-      <w:pPr>
-        <w:keepNext/>
-        <w:spacing w:before="240" w:after="80"/>
-      </w:pPr>
-      <w:r>
-        <w:rPr>
-          <w:rFonts w:ascii="Georgia" w:hAnsi="Georgia"/>
-          <w:b/>
-          <w:color w:val="B45309"/>
-          <w:sz w:val="24"/>
-        </w:rPr>
-        <w:t>Canon 3: Impartiality</w:t>
-      </w:r>
-    </w:p>
-    <w:p>
-      <w:pPr>
-        <w:spacing w:before="40" w:after="120" w:line="288" w:lineRule="auto"/>
-      </w:pPr>
-      <w:r>
-        <w:rPr>
-          <w:rFonts w:ascii="Calibri" w:hAnsi="Calibri"/>
-          <w:b/>
-          <w:color w:val="0F172A"/>
-          <w:sz w:val="22"/>
-        </w:rPr>
-        <w:t xml:space="preserve">Core Legal Mandate: </w:t>
-      </w:r>
-      <w:r>
-        <w:rPr>
-          <w:rFonts w:ascii="Calibri" w:hAnsi="Calibri"/>
-          <w:color w:val="334155"/>
-          <w:sz w:val="22"/>
-        </w:rPr>
-        <w:t>Impartiality applies not only to the decision itself but also to the entire trial process. A judge shall perform judicial duties with complete neutrality, fairness, and objectivity, free from bias or prejudice.</w:t>
-      </w:r>
-    </w:p>
-    <w:p>
-      <w:pPr>
-        <w:spacing w:before="0" w:after="160" w:line="288" w:lineRule="auto"/>
-        <w:ind w:left="360"/>
-      </w:pPr>
-      <w:r>
-        <w:rPr>
-          <w:rFonts w:ascii="Calibri" w:hAnsi="Calibri"/>
-          <w:b/>
-          <w:color w:val="B45309"/>
-          <w:sz w:val="21"/>
-        </w:rPr>
-        <w:t xml:space="preserve">Practical Meaning: </w:t>
-      </w:r>
-      <w:r>
-        <w:rPr>
-          <w:rFonts w:ascii="Calibri" w:hAnsi="Calibri"/>
-          <w:i/>
-          <w:color w:val="334155"/>
-          <w:sz w:val="21"/>
-        </w:rPr>
-        <w:t>"Act as a fair and neutral referee." Never favor any party, prosecutor, or defense counsel. Inhibit and recuse from hearing cases where a judge has a personal interest, prior involvement, or close familial relation with a litigant or lawyer.</w:t>
-      </w:r>
-    </w:p>
-    <w:p>
-      <w:pPr>
-        <w:keepNext/>
-        <w:spacing w:before="240" w:after="80"/>
-      </w:pPr>
-      <w:r>
-        <w:rPr>
-          <w:rFonts w:ascii="Georgia" w:hAnsi="Georgia"/>
-          <w:b/>
-          <w:color w:val="B45309"/>
-          <w:sz w:val="24"/>
-        </w:rPr>
-        <w:t>Canon 4: Propriety</w:t>
-      </w:r>
-    </w:p>
-    <w:p>
-      <w:pPr>
-        <w:spacing w:before="40" w:after="120" w:line="288" w:lineRule="auto"/>
-      </w:pPr>
-      <w:r>
-        <w:rPr>
-          <w:rFonts w:ascii="Calibri" w:hAnsi="Calibri"/>
-          <w:b/>
-          <w:color w:val="0F172A"/>
-          <w:sz w:val="22"/>
-        </w:rPr>
-        <w:t xml:space="preserve">Core Legal Mandate: </w:t>
-      </w:r>
-      <w:r>
-        <w:rPr>
-          <w:rFonts w:ascii="Calibri" w:hAnsi="Calibri"/>
-          <w:color w:val="334155"/>
-          <w:sz w:val="22"/>
-        </w:rPr>
-        <w:t>Propriety and the appearance of propriety are essential to the performance of all judicial activities. A judge shall avoid impropriety and the appearance of impropriety in both judicial and extra-judicial conduct.</w:t>
-      </w:r>
-    </w:p>
-    <w:p>
-      <w:pPr>
-        <w:spacing w:before="0" w:after="160" w:line="288" w:lineRule="auto"/>
-        <w:ind w:left="360"/>
-      </w:pPr>
-      <w:r>
-        <w:rPr>
-          <w:rFonts w:ascii="Calibri" w:hAnsi="Calibri"/>
-          <w:b/>
-          <w:color w:val="B45309"/>
-          <w:sz w:val="21"/>
-        </w:rPr>
-        <w:t xml:space="preserve">Practical Meaning: </w:t>
-      </w:r>
-      <w:r>
-        <w:rPr>
-          <w:rFonts w:ascii="Calibri" w:hAnsi="Calibri"/>
-          <w:i/>
-          <w:color w:val="334155"/>
-          <w:sz w:val="21"/>
-        </w:rPr>
-        <w:t>"Avoid looking shady or compromised." Live modestly and circumspectly. Avoid socializing closely or dining privately with practicing lawyers who have active cases pending before your court sala.</w:t>
-      </w:r>
-    </w:p>
-    <w:p>
-      <w:pPr>
-        <w:keepNext/>
-        <w:spacing w:before="240" w:after="80"/>
-      </w:pPr>
-      <w:r>
-        <w:rPr>
-          <w:rFonts w:ascii="Georgia" w:hAnsi="Georgia"/>
-          <w:b/>
-          <w:color w:val="B45309"/>
-          <w:sz w:val="24"/>
-        </w:rPr>
-        <w:t>Canon 5: Equality</w:t>
-      </w:r>
-    </w:p>
-    <w:p>
-      <w:pPr>
-        <w:spacing w:before="40" w:after="120" w:line="288" w:lineRule="auto"/>
-      </w:pPr>
-      <w:r>
-        <w:rPr>
-          <w:rFonts w:ascii="Calibri" w:hAnsi="Calibri"/>
-          <w:b/>
-          <w:color w:val="0F172A"/>
-          <w:sz w:val="22"/>
-        </w:rPr>
-        <w:t xml:space="preserve">Core Legal Mandate: </w:t>
-      </w:r>
-      <w:r>
-        <w:rPr>
-          <w:rFonts w:ascii="Calibri" w:hAnsi="Calibri"/>
-          <w:color w:val="334155"/>
-          <w:sz w:val="22"/>
-        </w:rPr>
-        <w:t>Ensuring equality of treatment to all before the courts is essential to the due performance of the judicial office. A judge shall be aware of and understand diversity in society and treat everyone with equal dignity.</w:t>
-      </w:r>
-    </w:p>
-    <w:p>
-      <w:pPr>
-        <w:spacing w:before="0" w:after="160" w:line="288" w:lineRule="auto"/>
-        <w:ind w:left="360"/>
-      </w:pPr>
-      <w:r>
-        <w:rPr>
-          <w:rFonts w:ascii="Calibri" w:hAnsi="Calibri"/>
-          <w:b/>
-          <w:color w:val="B45309"/>
-          <w:sz w:val="21"/>
-        </w:rPr>
-        <w:t xml:space="preserve">Practical Meaning: </w:t>
-      </w:r>
-      <w:r>
-        <w:rPr>
-          <w:rFonts w:ascii="Calibri" w:hAnsi="Calibri"/>
-          <w:i/>
-          <w:color w:val="334155"/>
-          <w:sz w:val="21"/>
-        </w:rPr>
-        <w:t>"Respect everyone in your courtroom." Treat rich and poor litigants, prominent counsel and young attorneys, victims and accused with equal patience, neutrality, courtesy, and fairness without condescension or bias.</w:t>
-      </w:r>
-    </w:p>
-    <w:p>
-      <w:pPr>
-        <w:keepNext/>
-        <w:spacing w:before="240" w:after="80"/>
-      </w:pPr>
-      <w:r>
-        <w:rPr>
-          <w:rFonts w:ascii="Georgia" w:hAnsi="Georgia"/>
-          <w:b/>
-          <w:color w:val="B45309"/>
-          <w:sz w:val="24"/>
-        </w:rPr>
-        <w:t>Canon 6: Competence and Diligence</w:t>
-      </w:r>
-    </w:p>
-    <w:p>
-      <w:pPr>
-        <w:spacing w:before="40" w:after="120" w:line="288" w:lineRule="auto"/>
-      </w:pPr>
-      <w:r>
-        <w:rPr>
-          <w:rFonts w:ascii="Calibri" w:hAnsi="Calibri"/>
-          <w:b/>
-          <w:color w:val="0F172A"/>
-          <w:sz w:val="22"/>
-        </w:rPr>
-        <w:t xml:space="preserve">Core Legal Mandate: </w:t>
-      </w:r>
-      <w:r>
-        <w:rPr>
-          <w:rFonts w:ascii="Calibri" w:hAnsi="Calibri"/>
-          <w:color w:val="334155"/>
-          <w:sz w:val="22"/>
-        </w:rPr>
-        <w:t>Competence and diligence are prerequisites to the due performance of judicial office. A judge shall maintain professional competence, manage courtroom dockets efficiently, and resolve cases within the reglementary periods prescribed by the Constitution and law.</w:t>
-      </w:r>
-    </w:p>
-    <w:p>
-      <w:pPr>
-        <w:spacing w:before="0" w:after="160" w:line="288" w:lineRule="auto"/>
-        <w:ind w:left="360"/>
-      </w:pPr>
-      <w:r>
-        <w:rPr>
-          <w:rFonts w:ascii="Calibri" w:hAnsi="Calibri"/>
-          <w:b/>
-          <w:color w:val="B45309"/>
-          <w:sz w:val="21"/>
-        </w:rPr>
-        <w:t xml:space="preserve">Practical Meaning: </w:t>
-      </w:r>
-      <w:r>
-        <w:rPr>
-          <w:rFonts w:ascii="Calibri" w:hAnsi="Calibri"/>
-          <w:i/>
-          <w:color w:val="334155"/>
-          <w:sz w:val="21"/>
-        </w:rPr>
-        <w:t>"Know the law and do not delay justice." Continuously master statutory amendments and Supreme Court jurisprudence, properly supervise court staff, and render clear, well-reasoned decisions within constitutional deadlines.</w:t>
-      </w:r>
-    </w:p>
-    <w:p>
-      <w:pPr>
-        <w:keepNext/>
-        <w:spacing w:before="360" w:after="120"/>
-      </w:pPr>
-      <w:r>
-        <w:rPr>
-          <w:rFonts w:ascii="Georgia" w:hAnsi="Georgia"/>
-          <w:b/>
-          <w:color w:val="0F172A"/>
-          <w:sz w:val="28"/>
+          <w:color w:val="0F2C59"/>
+          <w:sz w:val="26"/>
         </w:rPr>
         <w:t>PART III: COURT PERSONNEL ETHICS — CODE OF CONDUCT FOR COURT PERSONNEL (CCCP)</w:t>
       </w:r>
     </w:p>
     <w:p>
       <w:pPr>
-        <w:spacing w:before="40" w:after="160" w:line="288" w:lineRule="auto"/>
+        <w:spacing w:before="0" w:after="120"/>
       </w:pPr>
       <w:r>
         <w:rPr>
-          <w:rFonts w:ascii="Calibri" w:hAnsi="Calibri"/>
           <w:i/>
-          <w:color w:val="475569"/>
-          <w:sz w:val="22"/>
+          <w:sz w:val="20"/>
         </w:rPr>
-        <w:t>Promulgated under A.M. No. 03-06-13-SC, establishing strict ethical guidelines and public accountability standards for all Clerks of Court, Branch Clerks, Process Servers, Stenographers, and court administrative staff.</w:t>
+        <w:t>Promulgated under A.M. No. 03-06-13-SC, establishing ethical standards and public accountability for all Clerks of Court, Branch Clerks, Legal Researchers, Process Servers, Court Stenographers, and administrative staff.</w:t>
       </w:r>
     </w:p>
     <w:p>
       <w:pPr>
         <w:keepNext/>
-        <w:spacing w:before="240" w:after="80"/>
+        <w:spacing w:before="160" w:after="40"/>
       </w:pPr>
       <w:r>
         <w:rPr>
-          <w:rFonts w:ascii="Georgia" w:hAnsi="Georgia"/>
+          <w:rFonts w:ascii="Calibri" w:hAnsi="Calibri"/>
           <w:b/>
-          <w:color w:val="B45309"/>
-          <w:sz w:val="24"/>
+          <w:color w:val="0F2C59"/>
+          <w:sz w:val="23"/>
         </w:rPr>
         <w:t>Canon I: Fidelity to Duty</w:t>
       </w:r>
     </w:p>
     <w:p>
       <w:pPr>
-        <w:spacing w:before="40" w:after="120" w:line="288" w:lineRule="auto"/>
+        <w:spacing w:before="0" w:after="40" w:line="276" w:lineRule="auto"/>
+      </w:pPr>
+      <w:r>
+        <w:rPr>
+          <w:b/>
+          <w:color w:val="192D50"/>
+        </w:rPr>
+        <w:t xml:space="preserve">Core Legal Mandate: </w:t>
+      </w:r>
+      <w:r>
+        <w:t>Court personnel shall dedicate themselves to the honest, faithful, and diligent performance of their public duties, placing public interest above personal convenience or private financial gain.</w:t>
+      </w:r>
+    </w:p>
+    <w:p>
+      <w:pPr>
+        <w:spacing w:before="0" w:after="120" w:line="276" w:lineRule="auto"/>
+      </w:pPr>
+      <w:r>
+        <w:rPr>
+          <w:b/>
+          <w:color w:val="B45309"/>
+        </w:rPr>
+        <w:t xml:space="preserve">Practical Meaning: </w:t>
+      </w:r>
+      <w:r>
+        <w:rPr>
+          <w:i/>
+        </w:rPr>
+        <w:t>"Serve the court and the public honestly. Never solicit or accept tips, facilitation fees, or gifts from litigants, and never act as middlemen or fixers for private practitioners."</w:t>
+      </w:r>
+    </w:p>
+    <w:p>
+      <w:pPr>
+        <w:keepNext/>
+        <w:spacing w:before="160" w:after="40"/>
       </w:pPr>
       <w:r>
         <w:rPr>
           <w:rFonts w:ascii="Calibri" w:hAnsi="Calibri"/>
           <w:b/>
-          <w:color w:val="0F172A"/>
-          <w:sz w:val="22"/>
-        </w:rPr>
-        <w:t xml:space="preserve">Core Legal Mandate: </w:t>
-      </w:r>
-      <w:r>
-        <w:rPr>
-          <w:rFonts w:ascii="Calibri" w:hAnsi="Calibri"/>
-          <w:color w:val="334155"/>
-          <w:sz w:val="22"/>
-        </w:rPr>
-        <w:t>Court personnel shall dedicate themselves to the honest, faithful, and diligent performance of their public duties, placing public interest above personal convenience or private financial gain.</w:t>
-      </w:r>
-    </w:p>
-    <w:p>
-      <w:pPr>
-        <w:spacing w:before="0" w:after="160" w:line="288" w:lineRule="auto"/>
-        <w:ind w:left="360"/>
-      </w:pPr>
-      <w:r>
-        <w:rPr>
-          <w:rFonts w:ascii="Calibri" w:hAnsi="Calibri"/>
-          <w:b/>
-          <w:color w:val="B45309"/>
-          <w:sz w:val="21"/>
-        </w:rPr>
-        <w:t xml:space="preserve">Practical Meaning: </w:t>
-      </w:r>
-      <w:r>
-        <w:rPr>
-          <w:rFonts w:ascii="Calibri" w:hAnsi="Calibri"/>
-          <w:i/>
-          <w:color w:val="334155"/>
-          <w:sz w:val="21"/>
-        </w:rPr>
-        <w:t>"Serve the court and the public honestly." Never solicit or accept tips, facilitation fees, or bribes from litigants. Refrain from fixing cases or acting as middlemen for law firms.</w:t>
-      </w:r>
-    </w:p>
-    <w:p>
-      <w:pPr>
-        <w:keepNext/>
-        <w:spacing w:before="240" w:after="80"/>
-      </w:pPr>
-      <w:r>
-        <w:rPr>
-          <w:rFonts w:ascii="Georgia" w:hAnsi="Georgia"/>
-          <w:b/>
-          <w:color w:val="B45309"/>
-          <w:sz w:val="24"/>
+          <w:color w:val="0F2C59"/>
+          <w:sz w:val="23"/>
         </w:rPr>
         <w:t>Canon II: Confidentiality</w:t>
       </w:r>
     </w:p>
     <w:p>
       <w:pPr>
-        <w:spacing w:before="40" w:after="120" w:line="288" w:lineRule="auto"/>
+        <w:spacing w:before="0" w:after="40" w:line="276" w:lineRule="auto"/>
+      </w:pPr>
+      <w:r>
+        <w:rPr>
+          <w:b/>
+          <w:color w:val="192D50"/>
+        </w:rPr>
+        <w:t xml:space="preserve">Core Legal Mandate: </w:t>
+      </w:r>
+      <w:r>
+        <w:t>Court personnel shall maintain strict confidentiality concerning all official information, draft decisions, internal memoranda, case raffle results, and judicial deliberations acquired during their service.</w:t>
+      </w:r>
+    </w:p>
+    <w:p>
+      <w:pPr>
+        <w:spacing w:before="0" w:after="120" w:line="276" w:lineRule="auto"/>
+      </w:pPr>
+      <w:r>
+        <w:rPr>
+          <w:b/>
+          <w:color w:val="B45309"/>
+        </w:rPr>
+        <w:t xml:space="preserve">Practical Meaning: </w:t>
+      </w:r>
+      <w:r>
+        <w:rPr>
+          <w:i/>
+        </w:rPr>
+        <w:t>"Keep court records and secrets locked. Never leak draft orders, unsigned decisions, or confidential case documents to litigants, journalists, or third parties before official promulgation."</w:t>
+      </w:r>
+    </w:p>
+    <w:p>
+      <w:pPr>
+        <w:keepNext/>
+        <w:spacing w:before="160" w:after="40"/>
       </w:pPr>
       <w:r>
         <w:rPr>
           <w:rFonts w:ascii="Calibri" w:hAnsi="Calibri"/>
           <w:b/>
-          <w:color w:val="0F172A"/>
-          <w:sz w:val="22"/>
-        </w:rPr>
-        <w:t xml:space="preserve">Core Legal Mandate: </w:t>
-      </w:r>
-      <w:r>
-        <w:rPr>
-          <w:rFonts w:ascii="Calibri" w:hAnsi="Calibri"/>
-          <w:color w:val="334155"/>
-          <w:sz w:val="22"/>
-        </w:rPr>
-        <w:t>Court personnel shall maintain strict confidentiality concerning all official information, draft decisions, internal memoranda, case raffle results, and judicial deliberations acquired during their service.</w:t>
-      </w:r>
-    </w:p>
-    <w:p>
-      <w:pPr>
-        <w:spacing w:before="0" w:after="160" w:line="288" w:lineRule="auto"/>
-        <w:ind w:left="360"/>
-      </w:pPr>
-      <w:r>
-        <w:rPr>
-          <w:rFonts w:ascii="Calibri" w:hAnsi="Calibri"/>
-          <w:b/>
-          <w:color w:val="B45309"/>
-          <w:sz w:val="21"/>
-        </w:rPr>
-        <w:t xml:space="preserve">Practical Meaning: </w:t>
-      </w:r>
-      <w:r>
-        <w:rPr>
-          <w:rFonts w:ascii="Calibri" w:hAnsi="Calibri"/>
-          <w:i/>
-          <w:color w:val="334155"/>
-          <w:sz w:val="21"/>
-        </w:rPr>
-        <w:t>"Keep court records and secrets locked." Never leak draft orders, unsigned decisions, or confidential case records to litigants, journalists, or third parties before official promulgation.</w:t>
-      </w:r>
-    </w:p>
-    <w:p>
-      <w:pPr>
-        <w:keepNext/>
-        <w:spacing w:before="240" w:after="80"/>
-      </w:pPr>
-      <w:r>
-        <w:rPr>
-          <w:rFonts w:ascii="Georgia" w:hAnsi="Georgia"/>
-          <w:b/>
-          <w:color w:val="B45309"/>
-          <w:sz w:val="24"/>
+          <w:color w:val="0F2C59"/>
+          <w:sz w:val="23"/>
         </w:rPr>
         <w:t>Canon III: Conflict of Interest</w:t>
       </w:r>
     </w:p>
     <w:p>
       <w:pPr>
-        <w:spacing w:before="40" w:after="120" w:line="288" w:lineRule="auto"/>
+        <w:spacing w:before="0" w:after="40" w:line="276" w:lineRule="auto"/>
+      </w:pPr>
+      <w:r>
+        <w:rPr>
+          <w:b/>
+          <w:color w:val="192D50"/>
+        </w:rPr>
+        <w:t xml:space="preserve">Core Legal Mandate: </w:t>
+      </w:r>
+      <w:r>
+        <w:t>Court personnel shall not participate in any business transactions, private employment, or financial investments that conflict with or compromise their official duties and court responsibilities.</w:t>
+      </w:r>
+    </w:p>
+    <w:p>
+      <w:pPr>
+        <w:spacing w:before="0" w:after="120" w:line="276" w:lineRule="auto"/>
+      </w:pPr>
+      <w:r>
+        <w:rPr>
+          <w:b/>
+          <w:color w:val="B45309"/>
+        </w:rPr>
+        <w:t xml:space="preserve">Practical Meaning: </w:t>
+      </w:r>
+      <w:r>
+        <w:rPr>
+          <w:i/>
+        </w:rPr>
+        <w:t>"No shady side deals or commercial conflicts. Do not recommend private law practitioners to litigants, and do not enter into commercial dealings with individuals who have pending matters before the court."</w:t>
+      </w:r>
+    </w:p>
+    <w:p>
+      <w:pPr>
+        <w:keepNext/>
+        <w:spacing w:before="160" w:after="40"/>
       </w:pPr>
       <w:r>
         <w:rPr>
           <w:rFonts w:ascii="Calibri" w:hAnsi="Calibri"/>
           <w:b/>
-          <w:color w:val="0F172A"/>
-          <w:sz w:val="22"/>
-        </w:rPr>
-        <w:t xml:space="preserve">Core Legal Mandate: </w:t>
-      </w:r>
-      <w:r>
-        <w:rPr>
-          <w:rFonts w:ascii="Calibri" w:hAnsi="Calibri"/>
-          <w:color w:val="334155"/>
-          <w:sz w:val="22"/>
-        </w:rPr>
-        <w:t>Court personnel shall not participate in any business transactions, private employment, or financial investments that conflict with or compromise their official duties and court responsibilities.</w:t>
-      </w:r>
-    </w:p>
-    <w:p>
-      <w:pPr>
-        <w:spacing w:before="0" w:after="160" w:line="288" w:lineRule="auto"/>
-        <w:ind w:left="360"/>
-      </w:pPr>
-      <w:r>
-        <w:rPr>
-          <w:rFonts w:ascii="Calibri" w:hAnsi="Calibri"/>
-          <w:b/>
-          <w:color w:val="B45309"/>
-          <w:sz w:val="21"/>
-        </w:rPr>
-        <w:t xml:space="preserve">Practical Meaning: </w:t>
-      </w:r>
-      <w:r>
-        <w:rPr>
-          <w:rFonts w:ascii="Calibri" w:hAnsi="Calibri"/>
-          <w:i/>
-          <w:color w:val="334155"/>
-          <w:sz w:val="21"/>
-        </w:rPr>
-        <w:t>"No shady side deals or commercial conflicts." Do not recommend private law practitioners to litigants, and do not enter into commercial dealings with individuals who have pending matters before the court.</w:t>
-      </w:r>
-    </w:p>
-    <w:p>
-      <w:pPr>
-        <w:keepNext/>
-        <w:spacing w:before="240" w:after="80"/>
-      </w:pPr>
-      <w:r>
-        <w:rPr>
-          <w:rFonts w:ascii="Georgia" w:hAnsi="Georgia"/>
-          <w:b/>
-          <w:color w:val="B45309"/>
-          <w:sz w:val="24"/>
+          <w:color w:val="0F2C59"/>
+          <w:sz w:val="23"/>
         </w:rPr>
         <w:t>Canon IV: Performance of Duties</w:t>
       </w:r>
     </w:p>
     <w:p>
       <w:pPr>
-        <w:spacing w:before="40" w:after="120" w:line="288" w:lineRule="auto"/>
+        <w:spacing w:before="0" w:after="40" w:line="276" w:lineRule="auto"/>
       </w:pPr>
       <w:r>
         <w:rPr>
-          <w:rFonts w:ascii="Calibri" w:hAnsi="Calibri"/>
           <w:b/>
-          <w:color w:val="0F172A"/>
-          <w:sz w:val="22"/>
+          <w:color w:val="192D50"/>
         </w:rPr>
         <w:t xml:space="preserve">Core Legal Mandate: </w:t>
       </w:r>
       <w:r>
-        <w:rPr>
-          <w:rFonts w:ascii="Calibri" w:hAnsi="Calibri"/>
-          <w:color w:val="334155"/>
-          <w:sz w:val="22"/>
-        </w:rPr>
         <w:t>Court personnel shall perform their official duties promptly, courteously, efficiently, without discrimination, and in strict compliance with prescribed procedural guidelines and work schedules.</w:t>
       </w:r>
     </w:p>
     <w:p>
       <w:pPr>
-        <w:spacing w:before="0" w:after="160" w:line="288" w:lineRule="auto"/>
-        <w:ind w:left="360"/>
+        <w:spacing w:before="0" w:after="120" w:line="276" w:lineRule="auto"/>
       </w:pPr>
       <w:r>
         <w:rPr>
-          <w:rFonts w:ascii="Calibri" w:hAnsi="Calibri"/>
           <w:b/>
           <w:color w:val="B45309"/>
-          <w:sz w:val="21"/>
         </w:rPr>
         <w:t xml:space="preserve">Practical Meaning: </w:t>
       </w:r>
       <w:r>
         <w:rPr>
-          <w:rFonts w:ascii="Calibri" w:hAnsi="Calibri"/>
           <w:i/>
-          <w:color w:val="334155"/>
-          <w:sz w:val="21"/>
         </w:rPr>
-        <w:t>"Be prompt, hardworking, and polite." Arrive at the court on time, assist the public professionally without red tape or extortion, and execute court processes diligently.</w:t>
+        <w:t>"Be prompt, hardworking, and polite. Arrive at work on time, assist the public professionally without red tape, and execute court processes and notices diligently."</w:t>
       </w:r>
     </w:p>
     <w:p>
       <w:pPr>
         <w:keepNext/>
-        <w:spacing w:before="360" w:after="120"/>
+        <w:spacing w:before="320" w:after="80"/>
       </w:pPr>
       <w:r>
         <w:rPr>
           <w:rFonts w:ascii="Georgia" w:hAnsi="Georgia"/>
           <w:b/>
-          <w:color w:val="0F172A"/>
-          <w:sz w:val="28"/>
+          <w:color w:val="0F2C59"/>
+          <w:sz w:val="26"/>
         </w:rPr>
-        <w:t>PART IV: HISTORICAL COMPARATIVE REFERENCE — THE 1988 CODE OF PROFESSIONAL RESPONSIBILITY (CPR)</w:t>
+        <w:t>PART IV: HISTORICAL EVOLUTION &amp; COMPARATIVE ANALYSIS</w:t>
       </w:r>
     </w:p>
     <w:p>
       <w:pPr>
-        <w:spacing w:before="40" w:after="160" w:line="288" w:lineRule="auto"/>
+        <w:spacing w:before="0" w:after="120"/>
       </w:pPr>
       <w:r>
         <w:rPr>
-          <w:rFonts w:ascii="Calibri" w:hAnsi="Calibri"/>
           <w:i/>
-          <w:color w:val="475569"/>
-          <w:sz w:val="22"/>
+          <w:sz w:val="20"/>
         </w:rPr>
-        <w:t>The foundational 1988 Code of Professional Responsibility (Canons 1 to 22), organized into four major chapters reflecting the fourfold duty of a lawyer. Essential for comparative study, bar examination historical doctrines, and jurisprudential analysis.</w:t>
+        <w:t>A comparative roadmap tracing the statutory evolution of Philippine Legal and Judicial Ethics from the foundational 1988 CPR and 2004 NCJC to the modern 2023 CPRA and 2025 CJCA frameworks.</w:t>
       </w:r>
     </w:p>
-    <w:p>
-      <w:pPr>
-        <w:keepNext/>
-        <w:spacing w:before="240" w:after="80"/>
-      </w:pPr>
-      <w:r>
-        <w:rPr>
-          <w:rFonts w:ascii="Georgia" w:hAnsi="Georgia"/>
-          <w:b/>
-          <w:color w:val="B45309"/>
-          <w:sz w:val="24"/>
-        </w:rPr>
-        <w:t>Chapter I: The Lawyer and Society (Canons 1 to 6)</w:t>
-      </w:r>
-    </w:p>
-    <w:p>
-      <w:pPr>
-        <w:spacing w:before="40" w:after="120" w:line="288" w:lineRule="auto"/>
-      </w:pPr>
-      <w:r>
-        <w:rPr>
-          <w:rFonts w:ascii="Calibri" w:hAnsi="Calibri"/>
-          <w:b/>
-          <w:color w:val="0F172A"/>
-          <w:sz w:val="22"/>
-        </w:rPr>
-        <w:t xml:space="preserve">Scope and Core Principles: </w:t>
-      </w:r>
-      <w:r>
-        <w:rPr>
-          <w:rFonts w:ascii="Calibri" w:hAnsi="Calibri"/>
-          <w:color w:val="334155"/>
-          <w:sz w:val="22"/>
-        </w:rPr>
-        <w:t>Covers the lawyer's fundamental duties to uphold the Constitution, obey the laws of the land, promote respect for law and legal processes, make legal services available to all persons regardless of means, provide accurate and non-misleading information regarding legal services, and participate in continuous legal education and law reform.</w:t>
-      </w:r>
-    </w:p>
-    <w:p>
-      <w:pPr>
-        <w:spacing w:before="0" w:after="160" w:line="288" w:lineRule="auto"/>
-        <w:ind w:left="360"/>
-      </w:pPr>
-      <w:r>
-        <w:rPr>
-          <w:rFonts w:ascii="Calibri" w:hAnsi="Calibri"/>
-          <w:b/>
-          <w:color w:val="B45309"/>
-          <w:sz w:val="21"/>
-        </w:rPr>
-        <w:t xml:space="preserve">Practical Meaning: </w:t>
-      </w:r>
-      <w:r>
-        <w:rPr>
-          <w:rFonts w:ascii="Calibri" w:hAnsi="Calibri"/>
-          <w:i/>
-          <w:color w:val="334155"/>
-          <w:sz w:val="21"/>
-        </w:rPr>
-        <w:t>Lawyers must be law-abiding citizens and social leaders who champion justice, avoid illegal schemes, assist indigent litigants with pro bono service, and refrain from self-laudatory commercial advertisements.</w:t>
-      </w:r>
-    </w:p>
-    <w:p>
-      <w:pPr>
-        <w:keepNext/>
-        <w:spacing w:before="240" w:after="80"/>
-      </w:pPr>
-      <w:r>
-        <w:rPr>
-          <w:rFonts w:ascii="Georgia" w:hAnsi="Georgia"/>
-          <w:b/>
-          <w:color w:val="B45309"/>
-          <w:sz w:val="24"/>
-        </w:rPr>
-        <w:t>Chapter II: The Lawyer and the Legal Profession (Canons 7 to 9)</w:t>
-      </w:r>
-    </w:p>
-    <w:p>
-      <w:pPr>
-        <w:spacing w:before="40" w:after="120" w:line="288" w:lineRule="auto"/>
-      </w:pPr>
-      <w:r>
-        <w:rPr>
-          <w:rFonts w:ascii="Calibri" w:hAnsi="Calibri"/>
-          <w:b/>
-          <w:color w:val="0F172A"/>
-          <w:sz w:val="22"/>
-        </w:rPr>
-        <w:t xml:space="preserve">Scope and Core Principles: </w:t>
-      </w:r>
-      <w:r>
-        <w:rPr>
-          <w:rFonts w:ascii="Calibri" w:hAnsi="Calibri"/>
-          <w:color w:val="334155"/>
-          <w:sz w:val="22"/>
-        </w:rPr>
-        <w:t>Covers the lawyer's duties to uphold the integrity, nobility, and dignity of the legal profession at all times, treat fellow members of the Bar with courtesy, candor, and fairness, and assist in preventing the unauthorized practice of law by non-lawyers or suspended practitioners.</w:t>
-      </w:r>
-    </w:p>
-    <w:p>
-      <w:pPr>
-        <w:spacing w:before="0" w:after="160" w:line="288" w:lineRule="auto"/>
-        <w:ind w:left="360"/>
-      </w:pPr>
-      <w:r>
-        <w:rPr>
-          <w:rFonts w:ascii="Calibri" w:hAnsi="Calibri"/>
-          <w:b/>
-          <w:color w:val="B45309"/>
-          <w:sz w:val="21"/>
-        </w:rPr>
-        <w:t xml:space="preserve">Practical Meaning: </w:t>
-      </w:r>
-      <w:r>
-        <w:rPr>
-          <w:rFonts w:ascii="Calibri" w:hAnsi="Calibri"/>
-          <w:i/>
-          <w:color w:val="334155"/>
-          <w:sz w:val="21"/>
-        </w:rPr>
-        <w:t>Maintain the highest moral standards, never malign or deceive fellow lawyers, refrain from poaching clients, and never allow non-lawyers to practice law under your name.</w:t>
-      </w:r>
-    </w:p>
-    <w:p>
-      <w:pPr>
-        <w:keepNext/>
-        <w:spacing w:before="240" w:after="80"/>
-      </w:pPr>
-      <w:r>
-        <w:rPr>
-          <w:rFonts w:ascii="Georgia" w:hAnsi="Georgia"/>
-          <w:b/>
-          <w:color w:val="B45309"/>
-          <w:sz w:val="24"/>
-        </w:rPr>
-        <w:t>Chapter III: The Lawyer and the Courts (Canons 10 to 13)</w:t>
-      </w:r>
-    </w:p>
-    <w:p>
-      <w:pPr>
-        <w:spacing w:before="40" w:after="120" w:line="288" w:lineRule="auto"/>
-      </w:pPr>
-      <w:r>
-        <w:rPr>
-          <w:rFonts w:ascii="Calibri" w:hAnsi="Calibri"/>
-          <w:b/>
-          <w:color w:val="0F172A"/>
-          <w:sz w:val="22"/>
-        </w:rPr>
-        <w:t xml:space="preserve">Scope and Core Principles: </w:t>
-      </w:r>
-      <w:r>
-        <w:rPr>
-          <w:rFonts w:ascii="Calibri" w:hAnsi="Calibri"/>
-          <w:color w:val="334155"/>
-          <w:sz w:val="22"/>
-        </w:rPr>
-        <w:t>Covers the lawyer's duties of honesty, candor, and fairness to the courts, observing procedural rules, avoiding deceit or misquotation of statutes/records, assisting in the speedy and efficient administration of justice (avoiding forum shopping and frivolous appeals), observing respect and deference toward judicial officers, and refraining from acts or public statements that exert improper influence or prejudice pending court proceedings.</w:t>
-      </w:r>
-    </w:p>
-    <w:p>
-      <w:pPr>
-        <w:spacing w:before="0" w:after="160" w:line="288" w:lineRule="auto"/>
-        <w:ind w:left="360"/>
-      </w:pPr>
-      <w:r>
-        <w:rPr>
-          <w:rFonts w:ascii="Calibri" w:hAnsi="Calibri"/>
-          <w:b/>
-          <w:color w:val="B45309"/>
-          <w:sz w:val="21"/>
-        </w:rPr>
-        <w:t xml:space="preserve">Practical Meaning: </w:t>
-      </w:r>
-      <w:r>
-        <w:rPr>
-          <w:rFonts w:ascii="Calibri" w:hAnsi="Calibri"/>
-          <w:i/>
-          <w:color w:val="334155"/>
-          <w:sz w:val="21"/>
-        </w:rPr>
-        <w:t>Never lie to a judge, never misquote facts or laws, avoid delaying tactics, show respect to the bench, and never claim private influence over the court.</w:t>
-      </w:r>
-    </w:p>
-    <w:p>
-      <w:pPr>
-        <w:keepNext/>
-        <w:spacing w:before="240" w:after="80"/>
-      </w:pPr>
-      <w:r>
-        <w:rPr>
-          <w:rFonts w:ascii="Georgia" w:hAnsi="Georgia"/>
-          <w:b/>
-          <w:color w:val="B45309"/>
-          <w:sz w:val="24"/>
-        </w:rPr>
-        <w:t>Chapter IV: The Lawyer and the Client (Canons 14 to 22)</w:t>
-      </w:r>
-    </w:p>
-    <w:p>
-      <w:pPr>
-        <w:spacing w:before="40" w:after="120" w:line="288" w:lineRule="auto"/>
-      </w:pPr>
-      <w:r>
-        <w:rPr>
-          <w:rFonts w:ascii="Calibri" w:hAnsi="Calibri"/>
-          <w:b/>
-          <w:color w:val="0F172A"/>
-          <w:sz w:val="22"/>
-        </w:rPr>
-        <w:t xml:space="preserve">Scope and Core Principles: </w:t>
-      </w:r>
-      <w:r>
-        <w:rPr>
-          <w:rFonts w:ascii="Calibri" w:hAnsi="Calibri"/>
-          <w:color w:val="334155"/>
-          <w:sz w:val="22"/>
-        </w:rPr>
-        <w:t>Covers the availability of legal service, undivided loyalty and fidelity to client interests, absolute confidentiality of privileged communications, candor in legal advice, charging reasonable and transparent attorney's fees, accounting for and preserving client trust funds and properties, and observing ethical procedures when withdrawing from legal representation.</w:t>
-      </w:r>
-    </w:p>
-    <w:p>
-      <w:pPr>
-        <w:spacing w:before="0" w:after="160" w:line="288" w:lineRule="auto"/>
-        <w:ind w:left="360"/>
-      </w:pPr>
-      <w:r>
-        <w:rPr>
-          <w:rFonts w:ascii="Calibri" w:hAnsi="Calibri"/>
-          <w:b/>
-          <w:color w:val="B45309"/>
-          <w:sz w:val="21"/>
-        </w:rPr>
-        <w:t xml:space="preserve">Practical Meaning: </w:t>
-      </w:r>
-      <w:r>
-        <w:rPr>
-          <w:rFonts w:ascii="Calibri" w:hAnsi="Calibri"/>
-          <w:i/>
-          <w:color w:val="334155"/>
-          <w:sz w:val="21"/>
-        </w:rPr>
-        <w:t>Once engaged, give your best effort to your client, keep their secrets inviolate, never represent conflicting parties, handle client money with strict accounting, charge ethical fees, and never abandon a client without justifiable cause and court approval.</w:t>
-      </w:r>
-    </w:p>
+    <w:tbl>
+      <w:tblPr>
+        <w:tblW w:type="auto" w:w="0"/>
+        <w:jc w:val="center"/>
+        <w:tblLook w:firstColumn="1" w:firstRow="1" w:lastColumn="0" w:lastRow="0" w:noHBand="0" w:noVBand="1" w:val="04A0"/>
+      </w:tblPr>
+      <w:tblGrid>
+        <w:gridCol w:w="3120"/>
+        <w:gridCol w:w="3120"/>
+        <w:gridCol w:w="3120"/>
+      </w:tblGrid>
+      <w:tr>
+        <w:tc>
+          <w:tcPr>
+            <w:tcW w:type="dxa" w:w="2592"/>
+            <w:shd w:val="clear" w:color="auto" w:fill="1B365D"/>
+            <w:tcMar>
+              <w:top w:w="80" w:type="dxa"/>
+              <w:bottom w:w="80" w:type="dxa"/>
+              <w:left w:w="100" w:type="dxa"/>
+              <w:right w:w="100" w:type="dxa"/>
+            </w:tcMar>
+          </w:tcPr>
+          <w:p>
+            <w:pPr>
+              <w:spacing w:before="40" w:after="40" w:line="276" w:lineRule="auto"/>
+            </w:pPr>
+            <w:r>
+              <w:rPr>
+                <w:rFonts w:ascii="Calibri" w:hAnsi="Calibri"/>
+                <w:b/>
+                <w:color w:val="FFFFFF"/>
+                <w:sz w:val="19"/>
+              </w:rPr>
+              <w:t>ERA &amp; CODE</w:t>
+            </w:r>
+          </w:p>
+        </w:tc>
+        <w:tc>
+          <w:tcPr>
+            <w:tcW w:type="dxa" w:w="1872"/>
+            <w:shd w:val="clear" w:color="auto" w:fill="1B365D"/>
+            <w:tcMar>
+              <w:top w:w="80" w:type="dxa"/>
+              <w:bottom w:w="80" w:type="dxa"/>
+              <w:left w:w="100" w:type="dxa"/>
+              <w:right w:w="100" w:type="dxa"/>
+            </w:tcMar>
+          </w:tcPr>
+          <w:p>
+            <w:pPr>
+              <w:spacing w:before="40" w:after="40" w:line="276" w:lineRule="auto"/>
+            </w:pPr>
+            <w:r>
+              <w:rPr>
+                <w:rFonts w:ascii="Calibri" w:hAnsi="Calibri"/>
+                <w:b/>
+                <w:color w:val="FFFFFF"/>
+                <w:sz w:val="19"/>
+              </w:rPr>
+              <w:t>SUBJECT / BENCH</w:t>
+            </w:r>
+          </w:p>
+        </w:tc>
+        <w:tc>
+          <w:tcPr>
+            <w:tcW w:type="dxa" w:w="4896"/>
+            <w:shd w:val="clear" w:color="auto" w:fill="1B365D"/>
+            <w:tcMar>
+              <w:top w:w="80" w:type="dxa"/>
+              <w:bottom w:w="80" w:type="dxa"/>
+              <w:left w:w="100" w:type="dxa"/>
+              <w:right w:w="100" w:type="dxa"/>
+            </w:tcMar>
+          </w:tcPr>
+          <w:p>
+            <w:pPr>
+              <w:spacing w:before="40" w:after="40" w:line="276" w:lineRule="auto"/>
+            </w:pPr>
+            <w:r>
+              <w:rPr>
+                <w:rFonts w:ascii="Calibri" w:hAnsi="Calibri"/>
+                <w:b/>
+                <w:color w:val="FFFFFF"/>
+                <w:sz w:val="19"/>
+              </w:rPr>
+              <w:t>CANONS STRUCTURE &amp; KEY INNOVATIONS</w:t>
+            </w:r>
+          </w:p>
+        </w:tc>
+      </w:tr>
+      <w:tr>
+        <w:tc>
+          <w:tcPr>
+            <w:tcW w:type="dxa" w:w="2592"/>
+            <w:shd w:val="clear" w:color="auto" w:fill="F9FAFB"/>
+            <w:tcMar>
+              <w:top w:w="60" w:type="dxa"/>
+              <w:bottom w:w="60" w:type="dxa"/>
+              <w:left w:w="100" w:type="dxa"/>
+              <w:right w:w="100" w:type="dxa"/>
+            </w:tcMar>
+            <w:tcBorders>
+              <w:top w:val="single" w:sz="4" w:space="0" w:color="E5E7EB"/>
+              <w:bottom w:val="single" w:sz="4" w:space="0" w:color="E5E7EB"/>
+              <w:left w:val="single" w:sz="4" w:space="0" w:color="E5E7EB"/>
+              <w:right w:val="single" w:sz="4" w:space="0" w:color="E5E7EB"/>
+            </w:tcBorders>
+          </w:tcPr>
+          <w:p>
+            <w:pPr>
+              <w:spacing w:before="40" w:after="40" w:line="276" w:lineRule="auto"/>
+            </w:pPr>
+            <w:r>
+              <w:rPr>
+                <w:rFonts w:ascii="Calibri" w:hAnsi="Calibri"/>
+                <w:b/>
+                <w:color w:val="0F2C59"/>
+                <w:sz w:val="18"/>
+              </w:rPr>
+              <w:t>1988 CPR</w:t>
+              <w:br/>
+              <w:t>(Code of Professional Responsibility)</w:t>
+            </w:r>
+          </w:p>
+        </w:tc>
+        <w:tc>
+          <w:tcPr>
+            <w:tcW w:type="dxa" w:w="1872"/>
+            <w:shd w:val="clear" w:color="auto" w:fill="F9FAFB"/>
+            <w:tcMar>
+              <w:top w:w="60" w:type="dxa"/>
+              <w:bottom w:w="60" w:type="dxa"/>
+              <w:left w:w="100" w:type="dxa"/>
+              <w:right w:w="100" w:type="dxa"/>
+            </w:tcMar>
+            <w:tcBorders>
+              <w:top w:val="single" w:sz="4" w:space="0" w:color="E5E7EB"/>
+              <w:bottom w:val="single" w:sz="4" w:space="0" w:color="E5E7EB"/>
+              <w:left w:val="single" w:sz="4" w:space="0" w:color="E5E7EB"/>
+              <w:right w:val="single" w:sz="4" w:space="0" w:color="E5E7EB"/>
+            </w:tcBorders>
+          </w:tcPr>
+          <w:p>
+            <w:pPr>
+              <w:spacing w:before="40" w:after="40" w:line="276" w:lineRule="auto"/>
+            </w:pPr>
+            <w:r>
+              <w:rPr>
+                <w:rFonts w:ascii="Calibri" w:hAnsi="Calibri"/>
+                <w:b/>
+                <w:color w:val="B45309"/>
+                <w:sz w:val="18"/>
+              </w:rPr>
+              <w:t>Lawyers</w:t>
+            </w:r>
+          </w:p>
+        </w:tc>
+        <w:tc>
+          <w:tcPr>
+            <w:tcW w:type="dxa" w:w="4896"/>
+            <w:shd w:val="clear" w:color="auto" w:fill="F9FAFB"/>
+            <w:tcMar>
+              <w:top w:w="60" w:type="dxa"/>
+              <w:bottom w:w="60" w:type="dxa"/>
+              <w:left w:w="100" w:type="dxa"/>
+              <w:right w:w="100" w:type="dxa"/>
+            </w:tcMar>
+            <w:tcBorders>
+              <w:top w:val="single" w:sz="4" w:space="0" w:color="E5E7EB"/>
+              <w:bottom w:val="single" w:sz="4" w:space="0" w:color="E5E7EB"/>
+              <w:left w:val="single" w:sz="4" w:space="0" w:color="E5E7EB"/>
+              <w:right w:val="single" w:sz="4" w:space="0" w:color="E5E7EB"/>
+            </w:tcBorders>
+          </w:tcPr>
+          <w:p>
+            <w:pPr>
+              <w:spacing w:before="40" w:after="40" w:line="276" w:lineRule="auto"/>
+            </w:pPr>
+            <w:r>
+              <w:rPr>
+                <w:rFonts w:ascii="Calibri" w:hAnsi="Calibri"/>
+                <w:color w:val="282828"/>
+                <w:sz w:val="18"/>
+              </w:rPr>
+              <w:t>Canons 1–22 grouped into 4 Chapters:</w:t>
+              <w:br/>
+              <w:t>• Ch. I: Society (Canons 1–6)</w:t>
+              <w:br/>
+              <w:t>• Ch. II: Legal Profession (Canons 7–9)</w:t>
+              <w:br/>
+              <w:t>• Ch. III: Courts (Canons 10–13)</w:t>
+              <w:br/>
+              <w:t>• Ch. IV: Clients (Canons 14–22)</w:t>
+              <w:br/>
+              <w:t>Fourfold duty framework; superseded by 2023 CPRA.</w:t>
+            </w:r>
+          </w:p>
+        </w:tc>
+      </w:tr>
+      <w:tr>
+        <w:tc>
+          <w:tcPr>
+            <w:tcW w:type="dxa" w:w="2592"/>
+            <w:shd w:val="clear" w:color="auto" w:fill="FFFFFF"/>
+            <w:tcMar>
+              <w:top w:w="60" w:type="dxa"/>
+              <w:bottom w:w="60" w:type="dxa"/>
+              <w:left w:w="100" w:type="dxa"/>
+              <w:right w:w="100" w:type="dxa"/>
+            </w:tcMar>
+            <w:tcBorders>
+              <w:top w:val="single" w:sz="4" w:space="0" w:color="E5E7EB"/>
+              <w:bottom w:val="single" w:sz="4" w:space="0" w:color="E5E7EB"/>
+              <w:left w:val="single" w:sz="4" w:space="0" w:color="E5E7EB"/>
+              <w:right w:val="single" w:sz="4" w:space="0" w:color="E5E7EB"/>
+            </w:tcBorders>
+          </w:tcPr>
+          <w:p>
+            <w:pPr>
+              <w:spacing w:before="40" w:after="40" w:line="276" w:lineRule="auto"/>
+            </w:pPr>
+            <w:r>
+              <w:rPr>
+                <w:rFonts w:ascii="Calibri" w:hAnsi="Calibri"/>
+                <w:b/>
+                <w:color w:val="0F2C59"/>
+                <w:sz w:val="18"/>
+              </w:rPr>
+              <w:t>2004 NCJC</w:t>
+              <w:br/>
+              <w:t>(New Code of Judicial Conduct - A.M. No. 03-05-01-SC)</w:t>
+            </w:r>
+          </w:p>
+        </w:tc>
+        <w:tc>
+          <w:tcPr>
+            <w:tcW w:type="dxa" w:w="1872"/>
+            <w:shd w:val="clear" w:color="auto" w:fill="FFFFFF"/>
+            <w:tcMar>
+              <w:top w:w="60" w:type="dxa"/>
+              <w:bottom w:w="60" w:type="dxa"/>
+              <w:left w:w="100" w:type="dxa"/>
+              <w:right w:w="100" w:type="dxa"/>
+            </w:tcMar>
+            <w:tcBorders>
+              <w:top w:val="single" w:sz="4" w:space="0" w:color="E5E7EB"/>
+              <w:bottom w:val="single" w:sz="4" w:space="0" w:color="E5E7EB"/>
+              <w:left w:val="single" w:sz="4" w:space="0" w:color="E5E7EB"/>
+              <w:right w:val="single" w:sz="4" w:space="0" w:color="E5E7EB"/>
+            </w:tcBorders>
+          </w:tcPr>
+          <w:p>
+            <w:pPr>
+              <w:spacing w:before="40" w:after="40" w:line="276" w:lineRule="auto"/>
+            </w:pPr>
+            <w:r>
+              <w:rPr>
+                <w:rFonts w:ascii="Calibri" w:hAnsi="Calibri"/>
+                <w:b/>
+                <w:color w:val="B45309"/>
+                <w:sz w:val="18"/>
+              </w:rPr>
+              <w:t>Judges &amp; Justices</w:t>
+            </w:r>
+          </w:p>
+        </w:tc>
+        <w:tc>
+          <w:tcPr>
+            <w:tcW w:type="dxa" w:w="4896"/>
+            <w:shd w:val="clear" w:color="auto" w:fill="FFFFFF"/>
+            <w:tcMar>
+              <w:top w:w="60" w:type="dxa"/>
+              <w:bottom w:w="60" w:type="dxa"/>
+              <w:left w:w="100" w:type="dxa"/>
+              <w:right w:w="100" w:type="dxa"/>
+            </w:tcMar>
+            <w:tcBorders>
+              <w:top w:val="single" w:sz="4" w:space="0" w:color="E5E7EB"/>
+              <w:bottom w:val="single" w:sz="4" w:space="0" w:color="E5E7EB"/>
+              <w:left w:val="single" w:sz="4" w:space="0" w:color="E5E7EB"/>
+              <w:right w:val="single" w:sz="4" w:space="0" w:color="E5E7EB"/>
+            </w:tcBorders>
+          </w:tcPr>
+          <w:p>
+            <w:pPr>
+              <w:spacing w:before="40" w:after="40" w:line="276" w:lineRule="auto"/>
+            </w:pPr>
+            <w:r>
+              <w:rPr>
+                <w:rFonts w:ascii="Calibri" w:hAnsi="Calibri"/>
+                <w:color w:val="282828"/>
+                <w:sz w:val="18"/>
+              </w:rPr>
+              <w:t>6 Canons based on the Bangalore Principles:</w:t>
+              <w:br/>
+              <w:t>• Canon 1: Independence | Canon 2: Integrity</w:t>
+              <w:br/>
+              <w:t>• Canon 3: Impartiality | Canon 4: Propriety</w:t>
+              <w:br/>
+              <w:t>• Canon 5: Equality | Canon 6: Competence &amp; Diligence</w:t>
+              <w:br/>
+              <w:t>Superseded on Dec 21, 2025 by the 2025 CJCA.</w:t>
+            </w:r>
+          </w:p>
+        </w:tc>
+      </w:tr>
+      <w:tr>
+        <w:tc>
+          <w:tcPr>
+            <w:tcW w:type="dxa" w:w="2592"/>
+            <w:shd w:val="clear" w:color="auto" w:fill="F9FAFB"/>
+            <w:tcMar>
+              <w:top w:w="60" w:type="dxa"/>
+              <w:bottom w:w="60" w:type="dxa"/>
+              <w:left w:w="100" w:type="dxa"/>
+              <w:right w:w="100" w:type="dxa"/>
+            </w:tcMar>
+            <w:tcBorders>
+              <w:top w:val="single" w:sz="4" w:space="0" w:color="E5E7EB"/>
+              <w:bottom w:val="single" w:sz="4" w:space="0" w:color="E5E7EB"/>
+              <w:left w:val="single" w:sz="4" w:space="0" w:color="E5E7EB"/>
+              <w:right w:val="single" w:sz="4" w:space="0" w:color="E5E7EB"/>
+            </w:tcBorders>
+          </w:tcPr>
+          <w:p>
+            <w:pPr>
+              <w:spacing w:before="40" w:after="40" w:line="276" w:lineRule="auto"/>
+            </w:pPr>
+            <w:r>
+              <w:rPr>
+                <w:rFonts w:ascii="Calibri" w:hAnsi="Calibri"/>
+                <w:b/>
+                <w:color w:val="0F2C59"/>
+                <w:sz w:val="18"/>
+              </w:rPr>
+              <w:t>2023 CPRA</w:t>
+              <w:br/>
+              <w:t>(Code of Professional Responsibility &amp; Accountability - A.M. No. 22-04-05-SC)</w:t>
+            </w:r>
+          </w:p>
+        </w:tc>
+        <w:tc>
+          <w:tcPr>
+            <w:tcW w:type="dxa" w:w="1872"/>
+            <w:shd w:val="clear" w:color="auto" w:fill="F9FAFB"/>
+            <w:tcMar>
+              <w:top w:w="60" w:type="dxa"/>
+              <w:bottom w:w="60" w:type="dxa"/>
+              <w:left w:w="100" w:type="dxa"/>
+              <w:right w:w="100" w:type="dxa"/>
+            </w:tcMar>
+            <w:tcBorders>
+              <w:top w:val="single" w:sz="4" w:space="0" w:color="E5E7EB"/>
+              <w:bottom w:val="single" w:sz="4" w:space="0" w:color="E5E7EB"/>
+              <w:left w:val="single" w:sz="4" w:space="0" w:color="E5E7EB"/>
+              <w:right w:val="single" w:sz="4" w:space="0" w:color="E5E7EB"/>
+            </w:tcBorders>
+          </w:tcPr>
+          <w:p>
+            <w:pPr>
+              <w:spacing w:before="40" w:after="40" w:line="276" w:lineRule="auto"/>
+            </w:pPr>
+            <w:r>
+              <w:rPr>
+                <w:rFonts w:ascii="Calibri" w:hAnsi="Calibri"/>
+                <w:b/>
+                <w:color w:val="B45309"/>
+                <w:sz w:val="18"/>
+              </w:rPr>
+              <w:t>Lawyers</w:t>
+            </w:r>
+          </w:p>
+        </w:tc>
+        <w:tc>
+          <w:tcPr>
+            <w:tcW w:type="dxa" w:w="4896"/>
+            <w:shd w:val="clear" w:color="auto" w:fill="F9FAFB"/>
+            <w:tcMar>
+              <w:top w:w="60" w:type="dxa"/>
+              <w:bottom w:w="60" w:type="dxa"/>
+              <w:left w:w="100" w:type="dxa"/>
+              <w:right w:w="100" w:type="dxa"/>
+            </w:tcMar>
+            <w:tcBorders>
+              <w:top w:val="single" w:sz="4" w:space="0" w:color="E5E7EB"/>
+              <w:bottom w:val="single" w:sz="4" w:space="0" w:color="E5E7EB"/>
+              <w:left w:val="single" w:sz="4" w:space="0" w:color="E5E7EB"/>
+              <w:right w:val="single" w:sz="4" w:space="0" w:color="E5E7EB"/>
+            </w:tcBorders>
+          </w:tcPr>
+          <w:p>
+            <w:pPr>
+              <w:spacing w:before="40" w:after="40" w:line="276" w:lineRule="auto"/>
+            </w:pPr>
+            <w:r>
+              <w:rPr>
+                <w:rFonts w:ascii="Calibri" w:hAnsi="Calibri"/>
+                <w:color w:val="282828"/>
+                <w:sz w:val="18"/>
+              </w:rPr>
+              <w:t>6 Core Value-Based Canons:</w:t>
+              <w:br/>
+              <w:t>• Canon I: Independence | Canon II: Propriety</w:t>
+              <w:br/>
+              <w:t>• Canon III: Fidelity | Canon IV: Competence &amp; Diligence</w:t>
+              <w:br/>
+              <w:t>• Canon V: Equality | Canon VI: Accountability</w:t>
+              <w:br/>
+              <w:t>Introduces digital/social media rules, CPRA disciplinary tiers, and gender sensitivity.</w:t>
+            </w:r>
+          </w:p>
+        </w:tc>
+      </w:tr>
+      <w:tr>
+        <w:tc>
+          <w:tcPr>
+            <w:tcW w:type="dxa" w:w="2592"/>
+            <w:shd w:val="clear" w:color="auto" w:fill="FFFFFF"/>
+            <w:tcMar>
+              <w:top w:w="60" w:type="dxa"/>
+              <w:bottom w:w="60" w:type="dxa"/>
+              <w:left w:w="100" w:type="dxa"/>
+              <w:right w:w="100" w:type="dxa"/>
+            </w:tcMar>
+            <w:tcBorders>
+              <w:top w:val="single" w:sz="4" w:space="0" w:color="E5E7EB"/>
+              <w:bottom w:val="single" w:sz="4" w:space="0" w:color="E5E7EB"/>
+              <w:left w:val="single" w:sz="4" w:space="0" w:color="E5E7EB"/>
+              <w:right w:val="single" w:sz="4" w:space="0" w:color="E5E7EB"/>
+            </w:tcBorders>
+          </w:tcPr>
+          <w:p>
+            <w:pPr>
+              <w:spacing w:before="40" w:after="40" w:line="276" w:lineRule="auto"/>
+            </w:pPr>
+            <w:r>
+              <w:rPr>
+                <w:rFonts w:ascii="Calibri" w:hAnsi="Calibri"/>
+                <w:b/>
+                <w:color w:val="0F2C59"/>
+                <w:sz w:val="18"/>
+              </w:rPr>
+              <w:t>2025 CJCA</w:t>
+              <w:br/>
+              <w:t>(Code of Judicial Conduct &amp; Accountability - A.M. No. 25-04-04-SC)</w:t>
+            </w:r>
+          </w:p>
+        </w:tc>
+        <w:tc>
+          <w:tcPr>
+            <w:tcW w:type="dxa" w:w="1872"/>
+            <w:shd w:val="clear" w:color="auto" w:fill="FFFFFF"/>
+            <w:tcMar>
+              <w:top w:w="60" w:type="dxa"/>
+              <w:bottom w:w="60" w:type="dxa"/>
+              <w:left w:w="100" w:type="dxa"/>
+              <w:right w:w="100" w:type="dxa"/>
+            </w:tcMar>
+            <w:tcBorders>
+              <w:top w:val="single" w:sz="4" w:space="0" w:color="E5E7EB"/>
+              <w:bottom w:val="single" w:sz="4" w:space="0" w:color="E5E7EB"/>
+              <w:left w:val="single" w:sz="4" w:space="0" w:color="E5E7EB"/>
+              <w:right w:val="single" w:sz="4" w:space="0" w:color="E5E7EB"/>
+            </w:tcBorders>
+          </w:tcPr>
+          <w:p>
+            <w:pPr>
+              <w:spacing w:before="40" w:after="40" w:line="276" w:lineRule="auto"/>
+            </w:pPr>
+            <w:r>
+              <w:rPr>
+                <w:rFonts w:ascii="Calibri" w:hAnsi="Calibri"/>
+                <w:b/>
+                <w:color w:val="B45309"/>
+                <w:sz w:val="18"/>
+              </w:rPr>
+              <w:t>Judges &amp; Justices</w:t>
+            </w:r>
+          </w:p>
+        </w:tc>
+        <w:tc>
+          <w:tcPr>
+            <w:tcW w:type="dxa" w:w="4896"/>
+            <w:shd w:val="clear" w:color="auto" w:fill="FFFFFF"/>
+            <w:tcMar>
+              <w:top w:w="60" w:type="dxa"/>
+              <w:bottom w:w="60" w:type="dxa"/>
+              <w:left w:w="100" w:type="dxa"/>
+              <w:right w:w="100" w:type="dxa"/>
+            </w:tcMar>
+            <w:tcBorders>
+              <w:top w:val="single" w:sz="4" w:space="0" w:color="E5E7EB"/>
+              <w:bottom w:val="single" w:sz="4" w:space="0" w:color="E5E7EB"/>
+              <w:left w:val="single" w:sz="4" w:space="0" w:color="E5E7EB"/>
+              <w:right w:val="single" w:sz="4" w:space="0" w:color="E5E7EB"/>
+            </w:tcBorders>
+          </w:tcPr>
+          <w:p>
+            <w:pPr>
+              <w:spacing w:before="40" w:after="40" w:line="276" w:lineRule="auto"/>
+            </w:pPr>
+            <w:r>
+              <w:rPr>
+                <w:rFonts w:ascii="Calibri" w:hAnsi="Calibri"/>
+                <w:color w:val="282828"/>
+                <w:sz w:val="18"/>
+              </w:rPr>
+              <w:t>7 Core Value-Based Canons:</w:t>
+              <w:br/>
+              <w:t>• Canon I: Independence | Canon II: Fidelity (NEW!)</w:t>
+              <w:br/>
+              <w:t>• Canon III: Impartiality | Canon IV: Propriety (Social Media)</w:t>
+              <w:br/>
+              <w:t>• Canon V: Equality | Canon VI: Competence &amp; Diligence (AI)</w:t>
+              <w:br/>
+              <w:t>• Canon VII: Accountability (JIO Formal Process &amp; Clemency)</w:t>
+              <w:br/>
+              <w:t>Modernizes judicial ethics under the SPJI 2022-2027 framework.</w:t>
+            </w:r>
+          </w:p>
+        </w:tc>
+      </w:tr>
+    </w:tbl>
     <w:sectPr>
       <w:pgSz w:w="12240" w:h="15840"/>
       <w:pgMar w:top="1440" w:right="1440" w:bottom="1440" w:left="1440" w:header="720" w:footer="720" w:gutter="0"/>
@@ -1741,6 +1869,11 @@
     <w:name w:val="Normal"/>
     <w:qFormat/>
     <w:rsid w:val="00FC693F"/>
+    <w:rPr>
+      <w:rFonts w:ascii="Calibri" w:hAnsi="Calibri"/>
+      <w:color w:val="282828"/>
+      <w:sz w:val="22"/>
+    </w:rPr>
   </w:style>
   <w:style w:type="paragraph" w:styleId="Header">
     <w:name w:val="header"/>

</xml_diff>